<commit_message>
Add starter fees to all 4 membership tiers
Each tier now has a one-time starter fee ($99–$249) displayed on the
membership card, editable in financials, and factored into total revenue.
Summary shows monthly vs starter fee revenue separately. Word document
regenerated with starter fees, revenue breakdown, and Year 1 value.

https://claude.ai/code/session_01HqU4ErrWnzXnaEuVR9jfts
</commit_message>
<xml_diff>
--- a/Shape_the_Wave_Memberships.docx
+++ b/Shape_the_Wave_Memberships.docx
@@ -40,15 +40,16 @@
         <w:tblLook w:firstColumn="1" w:firstRow="1" w:lastColumn="0" w:lastRow="0" w:noHBand="0" w:noVBand="1" w:val="04A0"/>
       </w:tblPr>
       <w:tblGrid>
-        <w:gridCol w:w="2160"/>
-        <w:gridCol w:w="2160"/>
-        <w:gridCol w:w="2160"/>
-        <w:gridCol w:w="2160"/>
+        <w:gridCol w:w="1728"/>
+        <w:gridCol w:w="1728"/>
+        <w:gridCol w:w="1728"/>
+        <w:gridCol w:w="1728"/>
+        <w:gridCol w:w="1728"/>
       </w:tblGrid>
       <w:tr>
         <w:tc>
           <w:tcPr>
-            <w:tcW w:type="dxa" w:w="2160"/>
+            <w:tcW w:type="dxa" w:w="1728"/>
           </w:tcPr>
           <w:p>
             <w:r>
@@ -61,7 +62,7 @@
         </w:tc>
         <w:tc>
           <w:tcPr>
-            <w:tcW w:type="dxa" w:w="2160"/>
+            <w:tcW w:type="dxa" w:w="1728"/>
           </w:tcPr>
           <w:p>
             <w:r>
@@ -74,20 +75,33 @@
         </w:tc>
         <w:tc>
           <w:tcPr>
-            <w:tcW w:type="dxa" w:w="2160"/>
+            <w:tcW w:type="dxa" w:w="1728"/>
           </w:tcPr>
           <w:p>
             <w:r>
               <w:rPr>
                 <w:b/>
               </w:rPr>
-              <w:t>Price</w:t>
+              <w:t>Starter Fee</w:t>
             </w:r>
           </w:p>
         </w:tc>
         <w:tc>
           <w:tcPr>
-            <w:tcW w:type="dxa" w:w="2160"/>
+            <w:tcW w:type="dxa" w:w="1728"/>
+          </w:tcPr>
+          <w:p>
+            <w:r>
+              <w:rPr>
+                <w:b/>
+              </w:rPr>
+              <w:t>Monthly Price</w:t>
+            </w:r>
+          </w:p>
+        </w:tc>
+        <w:tc>
+          <w:tcPr>
+            <w:tcW w:type="dxa" w:w="1728"/>
           </w:tcPr>
           <w:p>
             <w:r>
@@ -102,7 +116,7 @@
       <w:tr>
         <w:tc>
           <w:tcPr>
-            <w:tcW w:type="dxa" w:w="2160"/>
+            <w:tcW w:type="dxa" w:w="1728"/>
           </w:tcPr>
           <w:p>
             <w:r>
@@ -112,7 +126,7 @@
         </w:tc>
         <w:tc>
           <w:tcPr>
-            <w:tcW w:type="dxa" w:w="2160"/>
+            <w:tcW w:type="dxa" w:w="1728"/>
           </w:tcPr>
           <w:p>
             <w:r>
@@ -122,7 +136,17 @@
         </w:tc>
         <w:tc>
           <w:tcPr>
-            <w:tcW w:type="dxa" w:w="2160"/>
+            <w:tcW w:type="dxa" w:w="1728"/>
+          </w:tcPr>
+          <w:p>
+            <w:r>
+              <w:t>$99</w:t>
+            </w:r>
+          </w:p>
+        </w:tc>
+        <w:tc>
+          <w:tcPr>
+            <w:tcW w:type="dxa" w:w="1728"/>
           </w:tcPr>
           <w:p>
             <w:r>
@@ -132,7 +156,7 @@
         </w:tc>
         <w:tc>
           <w:tcPr>
-            <w:tcW w:type="dxa" w:w="2160"/>
+            <w:tcW w:type="dxa" w:w="1728"/>
           </w:tcPr>
           <w:p>
             <w:r>
@@ -144,7 +168,7 @@
       <w:tr>
         <w:tc>
           <w:tcPr>
-            <w:tcW w:type="dxa" w:w="2160"/>
+            <w:tcW w:type="dxa" w:w="1728"/>
           </w:tcPr>
           <w:p>
             <w:r>
@@ -154,7 +178,7 @@
         </w:tc>
         <w:tc>
           <w:tcPr>
-            <w:tcW w:type="dxa" w:w="2160"/>
+            <w:tcW w:type="dxa" w:w="1728"/>
           </w:tcPr>
           <w:p>
             <w:r>
@@ -164,7 +188,17 @@
         </w:tc>
         <w:tc>
           <w:tcPr>
-            <w:tcW w:type="dxa" w:w="2160"/>
+            <w:tcW w:type="dxa" w:w="1728"/>
+          </w:tcPr>
+          <w:p>
+            <w:r>
+              <w:t>$149</w:t>
+            </w:r>
+          </w:p>
+        </w:tc>
+        <w:tc>
+          <w:tcPr>
+            <w:tcW w:type="dxa" w:w="1728"/>
           </w:tcPr>
           <w:p>
             <w:r>
@@ -174,7 +208,7 @@
         </w:tc>
         <w:tc>
           <w:tcPr>
-            <w:tcW w:type="dxa" w:w="2160"/>
+            <w:tcW w:type="dxa" w:w="1728"/>
           </w:tcPr>
           <w:p>
             <w:r>
@@ -186,7 +220,7 @@
       <w:tr>
         <w:tc>
           <w:tcPr>
-            <w:tcW w:type="dxa" w:w="2160"/>
+            <w:tcW w:type="dxa" w:w="1728"/>
           </w:tcPr>
           <w:p>
             <w:r>
@@ -196,7 +230,7 @@
         </w:tc>
         <w:tc>
           <w:tcPr>
-            <w:tcW w:type="dxa" w:w="2160"/>
+            <w:tcW w:type="dxa" w:w="1728"/>
           </w:tcPr>
           <w:p>
             <w:r>
@@ -206,7 +240,17 @@
         </w:tc>
         <w:tc>
           <w:tcPr>
-            <w:tcW w:type="dxa" w:w="2160"/>
+            <w:tcW w:type="dxa" w:w="1728"/>
+          </w:tcPr>
+          <w:p>
+            <w:r>
+              <w:t>$199</w:t>
+            </w:r>
+          </w:p>
+        </w:tc>
+        <w:tc>
+          <w:tcPr>
+            <w:tcW w:type="dxa" w:w="1728"/>
           </w:tcPr>
           <w:p>
             <w:r>
@@ -216,7 +260,7 @@
         </w:tc>
         <w:tc>
           <w:tcPr>
-            <w:tcW w:type="dxa" w:w="2160"/>
+            <w:tcW w:type="dxa" w:w="1728"/>
           </w:tcPr>
           <w:p>
             <w:r>
@@ -228,7 +272,7 @@
       <w:tr>
         <w:tc>
           <w:tcPr>
-            <w:tcW w:type="dxa" w:w="2160"/>
+            <w:tcW w:type="dxa" w:w="1728"/>
           </w:tcPr>
           <w:p>
             <w:r>
@@ -238,7 +282,7 @@
         </w:tc>
         <w:tc>
           <w:tcPr>
-            <w:tcW w:type="dxa" w:w="2160"/>
+            <w:tcW w:type="dxa" w:w="1728"/>
           </w:tcPr>
           <w:p>
             <w:r>
@@ -248,7 +292,17 @@
         </w:tc>
         <w:tc>
           <w:tcPr>
-            <w:tcW w:type="dxa" w:w="2160"/>
+            <w:tcW w:type="dxa" w:w="1728"/>
+          </w:tcPr>
+          <w:p>
+            <w:r>
+              <w:t>$249</w:t>
+            </w:r>
+          </w:p>
+        </w:tc>
+        <w:tc>
+          <w:tcPr>
+            <w:tcW w:type="dxa" w:w="1728"/>
           </w:tcPr>
           <w:p>
             <w:r>
@@ -258,7 +312,7 @@
         </w:tc>
         <w:tc>
           <w:tcPr>
-            <w:tcW w:type="dxa" w:w="2160"/>
+            <w:tcW w:type="dxa" w:w="1728"/>
           </w:tcPr>
           <w:p>
             <w:r>
@@ -274,7 +328,7 @@
         <w:pStyle w:val="Heading1"/>
       </w:pPr>
       <w:r>
-        <w:t>1. Wellness — $149/mo</w:t>
+        <w:t>1. Wellness</w:t>
       </w:r>
     </w:p>
     <w:p>
@@ -288,7 +342,28 @@
         <w:t>Starter</w:t>
       </w:r>
     </w:p>
-    <w:p/>
+    <w:p>
+      <w:r>
+        <w:rPr>
+          <w:b/>
+        </w:rPr>
+        <w:t xml:space="preserve">Starter Fee: </w:t>
+      </w:r>
+      <w:r>
+        <w:t>$99 (one-time)</w:t>
+      </w:r>
+    </w:p>
+    <w:p>
+      <w:r>
+        <w:rPr>
+          <w:b/>
+        </w:rPr>
+        <w:t xml:space="preserve">Monthly Price: </w:t>
+      </w:r>
+      <w:r>
+        <w:t>$149/mo</w:t>
+      </w:r>
+    </w:p>
     <w:p>
       <w:pPr>
         <w:pStyle w:val="Heading2"/>
@@ -399,7 +474,7 @@
         <w:pStyle w:val="Heading1"/>
       </w:pPr>
       <w:r>
-        <w:t>2. Transform — $299/mo</w:t>
+        <w:t>2. Transform (Weight Loss Bundle)</w:t>
       </w:r>
     </w:p>
     <w:p>
@@ -410,10 +485,31 @@
         <w:t xml:space="preserve">Tier: </w:t>
       </w:r>
       <w:r>
-        <w:t>Transform (Weight Loss Bundle)</w:t>
+        <w:t>Transform</w:t>
       </w:r>
     </w:p>
-    <w:p/>
+    <w:p>
+      <w:r>
+        <w:rPr>
+          <w:b/>
+        </w:rPr>
+        <w:t xml:space="preserve">Starter Fee: </w:t>
+      </w:r>
+      <w:r>
+        <w:t>$149 (one-time)</w:t>
+      </w:r>
+    </w:p>
+    <w:p>
+      <w:r>
+        <w:rPr>
+          <w:b/>
+        </w:rPr>
+        <w:t xml:space="preserve">Monthly Price: </w:t>
+      </w:r>
+      <w:r>
+        <w:t>$299/mo</w:t>
+      </w:r>
+    </w:p>
     <w:p>
       <w:pPr>
         <w:pStyle w:val="Heading2"/>
@@ -540,7 +636,7 @@
         <w:pStyle w:val="Heading1"/>
       </w:pPr>
       <w:r>
-        <w:t>3. Vitality — $399/mo</w:t>
+        <w:t>3. Vitality</w:t>
       </w:r>
     </w:p>
     <w:p>
@@ -554,7 +650,28 @@
         <w:t>Growth</w:t>
       </w:r>
     </w:p>
-    <w:p/>
+    <w:p>
+      <w:r>
+        <w:rPr>
+          <w:b/>
+        </w:rPr>
+        <w:t xml:space="preserve">Starter Fee: </w:t>
+      </w:r>
+      <w:r>
+        <w:t>$199 (one-time)</w:t>
+      </w:r>
+    </w:p>
+    <w:p>
+      <w:r>
+        <w:rPr>
+          <w:b/>
+        </w:rPr>
+        <w:t xml:space="preserve">Monthly Price: </w:t>
+      </w:r>
+      <w:r>
+        <w:t>$399/mo</w:t>
+      </w:r>
+    </w:p>
     <w:p>
       <w:pPr>
         <w:pStyle w:val="Heading2"/>
@@ -641,7 +758,7 @@
         <w:pStyle w:val="Heading1"/>
       </w:pPr>
       <w:r>
-        <w:t>4. Concierge — $599/mo</w:t>
+        <w:t>4. Concierge (All-Inclusive)</w:t>
       </w:r>
     </w:p>
     <w:p>
@@ -652,10 +769,31 @@
         <w:t xml:space="preserve">Tier: </w:t>
       </w:r>
       <w:r>
-        <w:t>Scale (All-Inclusive)</w:t>
+        <w:t>Scale</w:t>
       </w:r>
     </w:p>
-    <w:p/>
+    <w:p>
+      <w:r>
+        <w:rPr>
+          <w:b/>
+        </w:rPr>
+        <w:t xml:space="preserve">Starter Fee: </w:t>
+      </w:r>
+      <w:r>
+        <w:t>$249 (one-time)</w:t>
+      </w:r>
+    </w:p>
+    <w:p>
+      <w:r>
+        <w:rPr>
+          <w:b/>
+        </w:rPr>
+        <w:t xml:space="preserve">Monthly Price: </w:t>
+      </w:r>
+      <w:r>
+        <w:t>$599/mo</w:t>
+      </w:r>
+    </w:p>
     <w:p>
       <w:pPr>
         <w:pStyle w:val="Heading2"/>
@@ -746,16 +884,429 @@
         <w:tblLook w:firstColumn="1" w:firstRow="1" w:lastColumn="0" w:lastRow="0" w:noHBand="0" w:noVBand="1" w:val="04A0"/>
       </w:tblPr>
       <w:tblGrid>
-        <w:gridCol w:w="1728"/>
-        <w:gridCol w:w="1728"/>
-        <w:gridCol w:w="1728"/>
-        <w:gridCol w:w="1728"/>
-        <w:gridCol w:w="1728"/>
+        <w:gridCol w:w="1234"/>
+        <w:gridCol w:w="1234"/>
+        <w:gridCol w:w="1234"/>
+        <w:gridCol w:w="1234"/>
+        <w:gridCol w:w="1234"/>
+        <w:gridCol w:w="1234"/>
+        <w:gridCol w:w="1234"/>
       </w:tblGrid>
       <w:tr>
         <w:tc>
           <w:tcPr>
-            <w:tcW w:type="dxa" w:w="1728"/>
+            <w:tcW w:type="dxa" w:w="1234"/>
+          </w:tcPr>
+          <w:p>
+            <w:r>
+              <w:rPr>
+                <w:b/>
+                <w:sz w:val="18"/>
+              </w:rPr>
+              <w:t>Membership</w:t>
+            </w:r>
+          </w:p>
+        </w:tc>
+        <w:tc>
+          <w:tcPr>
+            <w:tcW w:type="dxa" w:w="1234"/>
+          </w:tcPr>
+          <w:p>
+            <w:r>
+              <w:rPr>
+                <w:b/>
+                <w:sz w:val="18"/>
+              </w:rPr>
+              <w:t>Starter Fee</w:t>
+            </w:r>
+          </w:p>
+        </w:tc>
+        <w:tc>
+          <w:tcPr>
+            <w:tcW w:type="dxa" w:w="1234"/>
+          </w:tcPr>
+          <w:p>
+            <w:r>
+              <w:rPr>
+                <w:b/>
+                <w:sz w:val="18"/>
+              </w:rPr>
+              <w:t>Cost/Member</w:t>
+            </w:r>
+          </w:p>
+        </w:tc>
+        <w:tc>
+          <w:tcPr>
+            <w:tcW w:type="dxa" w:w="1234"/>
+          </w:tcPr>
+          <w:p>
+            <w:r>
+              <w:rPr>
+                <w:b/>
+                <w:sz w:val="18"/>
+              </w:rPr>
+              <w:t>Monthly Price</w:t>
+            </w:r>
+          </w:p>
+        </w:tc>
+        <w:tc>
+          <w:tcPr>
+            <w:tcW w:type="dxa" w:w="1234"/>
+          </w:tcPr>
+          <w:p>
+            <w:r>
+              <w:rPr>
+                <w:b/>
+                <w:sz w:val="18"/>
+              </w:rPr>
+              <w:t>Margin</w:t>
+            </w:r>
+          </w:p>
+        </w:tc>
+        <w:tc>
+          <w:tcPr>
+            <w:tcW w:type="dxa" w:w="1234"/>
+          </w:tcPr>
+          <w:p>
+            <w:r>
+              <w:rPr>
+                <w:b/>
+                <w:sz w:val="18"/>
+              </w:rPr>
+              <w:t>Est. Members</w:t>
+            </w:r>
+          </w:p>
+        </w:tc>
+        <w:tc>
+          <w:tcPr>
+            <w:tcW w:type="dxa" w:w="1234"/>
+          </w:tcPr>
+          <w:p>
+            <w:r>
+              <w:rPr>
+                <w:b/>
+                <w:sz w:val="18"/>
+              </w:rPr>
+              <w:t>Year 1 Value/Member</w:t>
+            </w:r>
+          </w:p>
+        </w:tc>
+      </w:tr>
+      <w:tr>
+        <w:tc>
+          <w:tcPr>
+            <w:tcW w:type="dxa" w:w="1234"/>
+          </w:tcPr>
+          <w:p>
+            <w:r>
+              <w:t>Wellness</w:t>
+            </w:r>
+          </w:p>
+        </w:tc>
+        <w:tc>
+          <w:tcPr>
+            <w:tcW w:type="dxa" w:w="1234"/>
+          </w:tcPr>
+          <w:p>
+            <w:r>
+              <w:t>$99</w:t>
+            </w:r>
+          </w:p>
+        </w:tc>
+        <w:tc>
+          <w:tcPr>
+            <w:tcW w:type="dxa" w:w="1234"/>
+          </w:tcPr>
+          <w:p>
+            <w:r>
+              <w:t>$45</w:t>
+            </w:r>
+          </w:p>
+        </w:tc>
+        <w:tc>
+          <w:tcPr>
+            <w:tcW w:type="dxa" w:w="1234"/>
+          </w:tcPr>
+          <w:p>
+            <w:r>
+              <w:t>$149</w:t>
+            </w:r>
+          </w:p>
+        </w:tc>
+        <w:tc>
+          <w:tcPr>
+            <w:tcW w:type="dxa" w:w="1234"/>
+          </w:tcPr>
+          <w:p>
+            <w:r>
+              <w:t>69.8%</w:t>
+            </w:r>
+          </w:p>
+        </w:tc>
+        <w:tc>
+          <w:tcPr>
+            <w:tcW w:type="dxa" w:w="1234"/>
+          </w:tcPr>
+          <w:p>
+            <w:r>
+              <w:t>180</w:t>
+            </w:r>
+          </w:p>
+        </w:tc>
+        <w:tc>
+          <w:tcPr>
+            <w:tcW w:type="dxa" w:w="1234"/>
+          </w:tcPr>
+          <w:p>
+            <w:r>
+              <w:t>$1,887</w:t>
+            </w:r>
+          </w:p>
+        </w:tc>
+      </w:tr>
+      <w:tr>
+        <w:tc>
+          <w:tcPr>
+            <w:tcW w:type="dxa" w:w="1234"/>
+          </w:tcPr>
+          <w:p>
+            <w:r>
+              <w:t>Transform</w:t>
+            </w:r>
+          </w:p>
+        </w:tc>
+        <w:tc>
+          <w:tcPr>
+            <w:tcW w:type="dxa" w:w="1234"/>
+          </w:tcPr>
+          <w:p>
+            <w:r>
+              <w:t>$149</w:t>
+            </w:r>
+          </w:p>
+        </w:tc>
+        <w:tc>
+          <w:tcPr>
+            <w:tcW w:type="dxa" w:w="1234"/>
+          </w:tcPr>
+          <w:p>
+            <w:r>
+              <w:t>$110</w:t>
+            </w:r>
+          </w:p>
+        </w:tc>
+        <w:tc>
+          <w:tcPr>
+            <w:tcW w:type="dxa" w:w="1234"/>
+          </w:tcPr>
+          <w:p>
+            <w:r>
+              <w:t>$299</w:t>
+            </w:r>
+          </w:p>
+        </w:tc>
+        <w:tc>
+          <w:tcPr>
+            <w:tcW w:type="dxa" w:w="1234"/>
+          </w:tcPr>
+          <w:p>
+            <w:r>
+              <w:t>63.2%</w:t>
+            </w:r>
+          </w:p>
+        </w:tc>
+        <w:tc>
+          <w:tcPr>
+            <w:tcW w:type="dxa" w:w="1234"/>
+          </w:tcPr>
+          <w:p>
+            <w:r>
+              <w:t>150</w:t>
+            </w:r>
+          </w:p>
+        </w:tc>
+        <w:tc>
+          <w:tcPr>
+            <w:tcW w:type="dxa" w:w="1234"/>
+          </w:tcPr>
+          <w:p>
+            <w:r>
+              <w:t>$3,737</w:t>
+            </w:r>
+          </w:p>
+        </w:tc>
+      </w:tr>
+      <w:tr>
+        <w:tc>
+          <w:tcPr>
+            <w:tcW w:type="dxa" w:w="1234"/>
+          </w:tcPr>
+          <w:p>
+            <w:r>
+              <w:t>Vitality</w:t>
+            </w:r>
+          </w:p>
+        </w:tc>
+        <w:tc>
+          <w:tcPr>
+            <w:tcW w:type="dxa" w:w="1234"/>
+          </w:tcPr>
+          <w:p>
+            <w:r>
+              <w:t>$199</w:t>
+            </w:r>
+          </w:p>
+        </w:tc>
+        <w:tc>
+          <w:tcPr>
+            <w:tcW w:type="dxa" w:w="1234"/>
+          </w:tcPr>
+          <w:p>
+            <w:r>
+              <w:t>$155</w:t>
+            </w:r>
+          </w:p>
+        </w:tc>
+        <w:tc>
+          <w:tcPr>
+            <w:tcW w:type="dxa" w:w="1234"/>
+          </w:tcPr>
+          <w:p>
+            <w:r>
+              <w:t>$399</w:t>
+            </w:r>
+          </w:p>
+        </w:tc>
+        <w:tc>
+          <w:tcPr>
+            <w:tcW w:type="dxa" w:w="1234"/>
+          </w:tcPr>
+          <w:p>
+            <w:r>
+              <w:t>61.2%</w:t>
+            </w:r>
+          </w:p>
+        </w:tc>
+        <w:tc>
+          <w:tcPr>
+            <w:tcW w:type="dxa" w:w="1234"/>
+          </w:tcPr>
+          <w:p>
+            <w:r>
+              <w:t>90</w:t>
+            </w:r>
+          </w:p>
+        </w:tc>
+        <w:tc>
+          <w:tcPr>
+            <w:tcW w:type="dxa" w:w="1234"/>
+          </w:tcPr>
+          <w:p>
+            <w:r>
+              <w:t>$4,987</w:t>
+            </w:r>
+          </w:p>
+        </w:tc>
+      </w:tr>
+      <w:tr>
+        <w:tc>
+          <w:tcPr>
+            <w:tcW w:type="dxa" w:w="1234"/>
+          </w:tcPr>
+          <w:p>
+            <w:r>
+              <w:t>Concierge</w:t>
+            </w:r>
+          </w:p>
+        </w:tc>
+        <w:tc>
+          <w:tcPr>
+            <w:tcW w:type="dxa" w:w="1234"/>
+          </w:tcPr>
+          <w:p>
+            <w:r>
+              <w:t>$249</w:t>
+            </w:r>
+          </w:p>
+        </w:tc>
+        <w:tc>
+          <w:tcPr>
+            <w:tcW w:type="dxa" w:w="1234"/>
+          </w:tcPr>
+          <w:p>
+            <w:r>
+              <w:t>$240</w:t>
+            </w:r>
+          </w:p>
+        </w:tc>
+        <w:tc>
+          <w:tcPr>
+            <w:tcW w:type="dxa" w:w="1234"/>
+          </w:tcPr>
+          <w:p>
+            <w:r>
+              <w:t>$599</w:t>
+            </w:r>
+          </w:p>
+        </w:tc>
+        <w:tc>
+          <w:tcPr>
+            <w:tcW w:type="dxa" w:w="1234"/>
+          </w:tcPr>
+          <w:p>
+            <w:r>
+              <w:t>59.9%</w:t>
+            </w:r>
+          </w:p>
+        </w:tc>
+        <w:tc>
+          <w:tcPr>
+            <w:tcW w:type="dxa" w:w="1234"/>
+          </w:tcPr>
+          <w:p>
+            <w:r>
+              <w:t>35</w:t>
+            </w:r>
+          </w:p>
+        </w:tc>
+        <w:tc>
+          <w:tcPr>
+            <w:tcW w:type="dxa" w:w="1234"/>
+          </w:tcPr>
+          <w:p>
+            <w:r>
+              <w:t>$7,437</w:t>
+            </w:r>
+          </w:p>
+        </w:tc>
+      </w:tr>
+    </w:tbl>
+    <w:p/>
+    <w:p>
+      <w:pPr>
+        <w:pStyle w:val="Heading1"/>
+      </w:pPr>
+      <w:r>
+        <w:t>Revenue Breakdown</w:t>
+      </w:r>
+    </w:p>
+    <w:tbl>
+      <w:tblPr>
+        <w:tblStyle w:val="MediumShading1-Accent1"/>
+        <w:tblW w:type="auto" w:w="0"/>
+        <w:jc w:val="center"/>
+        <w:tblLook w:firstColumn="1" w:firstRow="1" w:lastColumn="0" w:lastRow="0" w:noHBand="0" w:noVBand="1" w:val="04A0"/>
+      </w:tblPr>
+      <w:tblGrid>
+        <w:gridCol w:w="2160"/>
+        <w:gridCol w:w="2160"/>
+        <w:gridCol w:w="2160"/>
+        <w:gridCol w:w="2160"/>
+      </w:tblGrid>
+      <w:tr>
+        <w:tc>
+          <w:tcPr>
+            <w:tcW w:type="dxa" w:w="2160"/>
           </w:tcPr>
           <w:p>
             <w:r>
@@ -768,53 +1319,40 @@
         </w:tc>
         <w:tc>
           <w:tcPr>
-            <w:tcW w:type="dxa" w:w="1728"/>
+            <w:tcW w:type="dxa" w:w="2160"/>
           </w:tcPr>
           <w:p>
             <w:r>
               <w:rPr>
                 <w:b/>
               </w:rPr>
-              <w:t>Cost/Member</w:t>
+              <w:t>Monthly Revenue</w:t>
             </w:r>
           </w:p>
         </w:tc>
         <w:tc>
           <w:tcPr>
-            <w:tcW w:type="dxa" w:w="1728"/>
+            <w:tcW w:type="dxa" w:w="2160"/>
           </w:tcPr>
           <w:p>
             <w:r>
               <w:rPr>
                 <w:b/>
               </w:rPr>
-              <w:t>Price</w:t>
+              <w:t>Starter Fee Revenue</w:t>
             </w:r>
           </w:p>
         </w:tc>
         <w:tc>
           <w:tcPr>
-            <w:tcW w:type="dxa" w:w="1728"/>
+            <w:tcW w:type="dxa" w:w="2160"/>
           </w:tcPr>
           <w:p>
             <w:r>
               <w:rPr>
                 <w:b/>
               </w:rPr>
-              <w:t>Margin</w:t>
-            </w:r>
-          </w:p>
-        </w:tc>
-        <w:tc>
-          <w:tcPr>
-            <w:tcW w:type="dxa" w:w="1728"/>
-          </w:tcPr>
-          <w:p>
-            <w:r>
-              <w:rPr>
-                <w:b/>
-              </w:rPr>
-              <w:t>Est. Members</w:t>
+              <w:t>Total</w:t>
             </w:r>
           </w:p>
         </w:tc>
@@ -822,7 +1360,7 @@
       <w:tr>
         <w:tc>
           <w:tcPr>
-            <w:tcW w:type="dxa" w:w="1728"/>
+            <w:tcW w:type="dxa" w:w="2160"/>
           </w:tcPr>
           <w:p>
             <w:r>
@@ -832,41 +1370,31 @@
         </w:tc>
         <w:tc>
           <w:tcPr>
-            <w:tcW w:type="dxa" w:w="1728"/>
+            <w:tcW w:type="dxa" w:w="2160"/>
           </w:tcPr>
           <w:p>
             <w:r>
-              <w:t>$45</w:t>
+              <w:t>$26,820</w:t>
             </w:r>
           </w:p>
         </w:tc>
         <w:tc>
           <w:tcPr>
-            <w:tcW w:type="dxa" w:w="1728"/>
+            <w:tcW w:type="dxa" w:w="2160"/>
           </w:tcPr>
           <w:p>
             <w:r>
-              <w:t>$149</w:t>
+              <w:t>$17,820</w:t>
             </w:r>
           </w:p>
         </w:tc>
         <w:tc>
           <w:tcPr>
-            <w:tcW w:type="dxa" w:w="1728"/>
+            <w:tcW w:type="dxa" w:w="2160"/>
           </w:tcPr>
           <w:p>
             <w:r>
-              <w:t>69.8%</w:t>
-            </w:r>
-          </w:p>
-        </w:tc>
-        <w:tc>
-          <w:tcPr>
-            <w:tcW w:type="dxa" w:w="1728"/>
-          </w:tcPr>
-          <w:p>
-            <w:r>
-              <w:t>180</w:t>
+              <w:t>$44,640</w:t>
             </w:r>
           </w:p>
         </w:tc>
@@ -874,7 +1402,7 @@
       <w:tr>
         <w:tc>
           <w:tcPr>
-            <w:tcW w:type="dxa" w:w="1728"/>
+            <w:tcW w:type="dxa" w:w="2160"/>
           </w:tcPr>
           <w:p>
             <w:r>
@@ -884,41 +1412,31 @@
         </w:tc>
         <w:tc>
           <w:tcPr>
-            <w:tcW w:type="dxa" w:w="1728"/>
+            <w:tcW w:type="dxa" w:w="2160"/>
           </w:tcPr>
           <w:p>
             <w:r>
-              <w:t>$110</w:t>
+              <w:t>$44,850</w:t>
             </w:r>
           </w:p>
         </w:tc>
         <w:tc>
           <w:tcPr>
-            <w:tcW w:type="dxa" w:w="1728"/>
+            <w:tcW w:type="dxa" w:w="2160"/>
           </w:tcPr>
           <w:p>
             <w:r>
-              <w:t>$299</w:t>
+              <w:t>$22,350</w:t>
             </w:r>
           </w:p>
         </w:tc>
         <w:tc>
           <w:tcPr>
-            <w:tcW w:type="dxa" w:w="1728"/>
+            <w:tcW w:type="dxa" w:w="2160"/>
           </w:tcPr>
           <w:p>
             <w:r>
-              <w:t>63.2%</w:t>
-            </w:r>
-          </w:p>
-        </w:tc>
-        <w:tc>
-          <w:tcPr>
-            <w:tcW w:type="dxa" w:w="1728"/>
-          </w:tcPr>
-          <w:p>
-            <w:r>
-              <w:t>150</w:t>
+              <w:t>$67,200</w:t>
             </w:r>
           </w:p>
         </w:tc>
@@ -926,7 +1444,7 @@
       <w:tr>
         <w:tc>
           <w:tcPr>
-            <w:tcW w:type="dxa" w:w="1728"/>
+            <w:tcW w:type="dxa" w:w="2160"/>
           </w:tcPr>
           <w:p>
             <w:r>
@@ -936,41 +1454,31 @@
         </w:tc>
         <w:tc>
           <w:tcPr>
-            <w:tcW w:type="dxa" w:w="1728"/>
+            <w:tcW w:type="dxa" w:w="2160"/>
           </w:tcPr>
           <w:p>
             <w:r>
-              <w:t>$155</w:t>
+              <w:t>$35,910</w:t>
             </w:r>
           </w:p>
         </w:tc>
         <w:tc>
           <w:tcPr>
-            <w:tcW w:type="dxa" w:w="1728"/>
+            <w:tcW w:type="dxa" w:w="2160"/>
           </w:tcPr>
           <w:p>
             <w:r>
-              <w:t>$399</w:t>
+              <w:t>$17,910</w:t>
             </w:r>
           </w:p>
         </w:tc>
         <w:tc>
           <w:tcPr>
-            <w:tcW w:type="dxa" w:w="1728"/>
+            <w:tcW w:type="dxa" w:w="2160"/>
           </w:tcPr>
           <w:p>
             <w:r>
-              <w:t>61.2%</w:t>
-            </w:r>
-          </w:p>
-        </w:tc>
-        <w:tc>
-          <w:tcPr>
-            <w:tcW w:type="dxa" w:w="1728"/>
-          </w:tcPr>
-          <w:p>
-            <w:r>
-              <w:t>90</w:t>
+              <w:t>$53,820</w:t>
             </w:r>
           </w:p>
         </w:tc>
@@ -978,7 +1486,7 @@
       <w:tr>
         <w:tc>
           <w:tcPr>
-            <w:tcW w:type="dxa" w:w="1728"/>
+            <w:tcW w:type="dxa" w:w="2160"/>
           </w:tcPr>
           <w:p>
             <w:r>
@@ -988,41 +1496,85 @@
         </w:tc>
         <w:tc>
           <w:tcPr>
-            <w:tcW w:type="dxa" w:w="1728"/>
+            <w:tcW w:type="dxa" w:w="2160"/>
           </w:tcPr>
           <w:p>
             <w:r>
-              <w:t>$240</w:t>
+              <w:t>$20,965</w:t>
             </w:r>
           </w:p>
         </w:tc>
         <w:tc>
           <w:tcPr>
-            <w:tcW w:type="dxa" w:w="1728"/>
+            <w:tcW w:type="dxa" w:w="2160"/>
           </w:tcPr>
           <w:p>
             <w:r>
-              <w:t>$599</w:t>
+              <w:t>$8,715</w:t>
             </w:r>
           </w:p>
         </w:tc>
         <w:tc>
           <w:tcPr>
-            <w:tcW w:type="dxa" w:w="1728"/>
+            <w:tcW w:type="dxa" w:w="2160"/>
           </w:tcPr>
           <w:p>
             <w:r>
-              <w:t>59.9%</w:t>
+              <w:t>$29,680</w:t>
+            </w:r>
+          </w:p>
+        </w:tc>
+      </w:tr>
+      <w:tr>
+        <w:tc>
+          <w:tcPr>
+            <w:tcW w:type="dxa" w:w="2160"/>
+          </w:tcPr>
+          <w:p>
+            <w:r>
+              <w:rPr>
+                <w:b/>
+              </w:rPr>
+              <w:t>TOTAL</w:t>
             </w:r>
           </w:p>
         </w:tc>
         <w:tc>
           <w:tcPr>
-            <w:tcW w:type="dxa" w:w="1728"/>
+            <w:tcW w:type="dxa" w:w="2160"/>
           </w:tcPr>
           <w:p>
             <w:r>
-              <w:t>35</w:t>
+              <w:rPr>
+                <w:b/>
+              </w:rPr>
+              <w:t>$128,545</w:t>
+            </w:r>
+          </w:p>
+        </w:tc>
+        <w:tc>
+          <w:tcPr>
+            <w:tcW w:type="dxa" w:w="2160"/>
+          </w:tcPr>
+          <w:p>
+            <w:r>
+              <w:rPr>
+                <w:b/>
+              </w:rPr>
+              <w:t>$66,795</w:t>
+            </w:r>
+          </w:p>
+        </w:tc>
+        <w:tc>
+          <w:tcPr>
+            <w:tcW w:type="dxa" w:w="2160"/>
+          </w:tcPr>
+          <w:p>
+            <w:r>
+              <w:rPr>
+                <w:b/>
+              </w:rPr>
+              <w:t>$195,340</w:t>
             </w:r>
           </w:p>
         </w:tc>
@@ -1083,7 +1635,7 @@
           </w:tcPr>
           <w:p>
             <w:r>
-              <w:t>Total Monthly Revenue</w:t>
+              <w:t>Monthly Recurring Revenue</w:t>
             </w:r>
           </w:p>
         </w:tc>
@@ -1093,7 +1645,51 @@
           </w:tcPr>
           <w:p>
             <w:r>
-              <w:t>$117,435</w:t>
+              <w:t>$128,545</w:t>
+            </w:r>
+          </w:p>
+        </w:tc>
+      </w:tr>
+      <w:tr>
+        <w:tc>
+          <w:tcPr>
+            <w:tcW w:type="dxa" w:w="4320"/>
+          </w:tcPr>
+          <w:p>
+            <w:r>
+              <w:t>One-Time Starter Fee Revenue</w:t>
+            </w:r>
+          </w:p>
+        </w:tc>
+        <w:tc>
+          <w:tcPr>
+            <w:tcW w:type="dxa" w:w="4320"/>
+          </w:tcPr>
+          <w:p>
+            <w:r>
+              <w:t>$66,795</w:t>
+            </w:r>
+          </w:p>
+        </w:tc>
+      </w:tr>
+      <w:tr>
+        <w:tc>
+          <w:tcPr>
+            <w:tcW w:type="dxa" w:w="4320"/>
+          </w:tcPr>
+          <w:p>
+            <w:r>
+              <w:t>Total Revenue</w:t>
+            </w:r>
+          </w:p>
+        </w:tc>
+        <w:tc>
+          <w:tcPr>
+            <w:tcW w:type="dxa" w:w="4320"/>
+          </w:tcPr>
+          <w:p>
+            <w:r>
+              <w:t>$195,340</w:t>
             </w:r>
           </w:p>
         </w:tc>
@@ -1204,6 +1800,28 @@
           <w:p>
             <w:r>
               <w:t>37.50</w:t>
+            </w:r>
+          </w:p>
+        </w:tc>
+      </w:tr>
+      <w:tr>
+        <w:tc>
+          <w:tcPr>
+            <w:tcW w:type="dxa" w:w="4320"/>
+          </w:tcPr>
+          <w:p>
+            <w:r>
+              <w:t>Total Members</w:t>
+            </w:r>
+          </w:p>
+        </w:tc>
+        <w:tc>
+          <w:tcPr>
+            <w:tcW w:type="dxa" w:w="4320"/>
+          </w:tcPr>
+          <w:p>
+            <w:r>
+              <w:t>455</w:t>
             </w:r>
           </w:p>
         </w:tc>

</xml_diff>

<commit_message>
Separate Services, Packages, and Memberships as distinct concepts
Services: 20 individual a la carte treatments with cost/price/margin.
Packages: 4 service bundles (weight loss, aesthetics) sold independently,
NOT connected to memberships. Memberships: 4 recurring tiers (Wellness,
Vitality, Elite, Concierge) with credits, included services, products,
and starter fees. Word document updated with full breakdown.

https://claude.ai/code/session_01HqU4ErrWnzXnaEuVR9jfts
</commit_message>
<xml_diff>
--- a/Shape_the_Wave_Memberships.docx
+++ b/Shape_the_Wave_Memberships.docx
@@ -20,7 +20,20 @@
           <w:color w:val="666666"/>
           <w:sz w:val="28"/>
         </w:rPr>
-        <w:t>Membership &amp; Revenue Analysis</w:t>
+        <w:t>Services, Packages &amp; Memberships</w:t>
+      </w:r>
+    </w:p>
+    <w:p/>
+    <w:p>
+      <w:r>
+        <w:rPr>
+          <w:b/>
+          <w:color w:val="CC0000"/>
+        </w:rPr>
+        <w:t xml:space="preserve">KEY DISTINCTION:  </w:t>
+      </w:r>
+      <w:r>
+        <w:t>Services are individual treatments. Packages are bundles of services sold separately. Memberships are recurring monthly plans that include credits, services, and products. Packages have NO connection to memberships — they are independent purchases.</w:t>
       </w:r>
     </w:p>
     <w:p/>
@@ -29,7 +42,15 @@
         <w:pStyle w:val="Heading1"/>
       </w:pPr>
       <w:r>
-        <w:t>Membership Tiers Overview</w:t>
+        <w:t>1. Services (A La Carte)</w:t>
+      </w:r>
+    </w:p>
+    <w:p>
+      <w:r>
+        <w:rPr>
+          <w:i/>
+        </w:rPr>
+        <w:t>Individual services available for purchase by anyone — members and non-members alike.</w:t>
       </w:r>
     </w:p>
     <w:tbl>
@@ -40,16 +61,1417 @@
         <w:tblLook w:firstColumn="1" w:firstRow="1" w:lastColumn="0" w:lastRow="0" w:noHBand="0" w:noVBand="1" w:val="04A0"/>
       </w:tblPr>
       <w:tblGrid>
-        <w:gridCol w:w="1728"/>
-        <w:gridCol w:w="1728"/>
-        <w:gridCol w:w="1728"/>
-        <w:gridCol w:w="1728"/>
-        <w:gridCol w:w="1728"/>
+        <w:gridCol w:w="2160"/>
+        <w:gridCol w:w="2160"/>
+        <w:gridCol w:w="2160"/>
+        <w:gridCol w:w="2160"/>
       </w:tblGrid>
       <w:tr>
         <w:tc>
           <w:tcPr>
-            <w:tcW w:type="dxa" w:w="1728"/>
+            <w:tcW w:type="dxa" w:w="2160"/>
+          </w:tcPr>
+          <w:p>
+            <w:r>
+              <w:rPr>
+                <w:b/>
+              </w:rPr>
+              <w:t>Service</w:t>
+            </w:r>
+          </w:p>
+        </w:tc>
+        <w:tc>
+          <w:tcPr>
+            <w:tcW w:type="dxa" w:w="2160"/>
+          </w:tcPr>
+          <w:p>
+            <w:r>
+              <w:rPr>
+                <w:b/>
+              </w:rPr>
+              <w:t>Category</w:t>
+            </w:r>
+          </w:p>
+        </w:tc>
+        <w:tc>
+          <w:tcPr>
+            <w:tcW w:type="dxa" w:w="2160"/>
+          </w:tcPr>
+          <w:p>
+            <w:r>
+              <w:rPr>
+                <w:b/>
+              </w:rPr>
+              <w:t>Cost</w:t>
+            </w:r>
+          </w:p>
+        </w:tc>
+        <w:tc>
+          <w:tcPr>
+            <w:tcW w:type="dxa" w:w="2160"/>
+          </w:tcPr>
+          <w:p>
+            <w:r>
+              <w:rPr>
+                <w:b/>
+              </w:rPr>
+              <w:t>Price</w:t>
+            </w:r>
+          </w:p>
+        </w:tc>
+      </w:tr>
+      <w:tr>
+        <w:tc>
+          <w:tcPr>
+            <w:tcW w:type="dxa" w:w="2160"/>
+          </w:tcPr>
+          <w:p>
+            <w:r>
+              <w:t>Office Visit</w:t>
+            </w:r>
+          </w:p>
+        </w:tc>
+        <w:tc>
+          <w:tcPr>
+            <w:tcW w:type="dxa" w:w="2160"/>
+          </w:tcPr>
+          <w:p>
+            <w:r>
+              <w:t>Primary Care</w:t>
+            </w:r>
+          </w:p>
+        </w:tc>
+        <w:tc>
+          <w:tcPr>
+            <w:tcW w:type="dxa" w:w="2160"/>
+          </w:tcPr>
+          <w:p>
+            <w:r>
+              <w:t>$25</w:t>
+            </w:r>
+          </w:p>
+        </w:tc>
+        <w:tc>
+          <w:tcPr>
+            <w:tcW w:type="dxa" w:w="2160"/>
+          </w:tcPr>
+          <w:p>
+            <w:r>
+              <w:t>$75</w:t>
+            </w:r>
+          </w:p>
+        </w:tc>
+      </w:tr>
+      <w:tr>
+        <w:tc>
+          <w:tcPr>
+            <w:tcW w:type="dxa" w:w="2160"/>
+          </w:tcPr>
+          <w:p>
+            <w:r>
+              <w:t>Telehealth Visit</w:t>
+            </w:r>
+          </w:p>
+        </w:tc>
+        <w:tc>
+          <w:tcPr>
+            <w:tcW w:type="dxa" w:w="2160"/>
+          </w:tcPr>
+          <w:p>
+            <w:r>
+              <w:t>Primary Care</w:t>
+            </w:r>
+          </w:p>
+        </w:tc>
+        <w:tc>
+          <w:tcPr>
+            <w:tcW w:type="dxa" w:w="2160"/>
+          </w:tcPr>
+          <w:p>
+            <w:r>
+              <w:t>$10</w:t>
+            </w:r>
+          </w:p>
+        </w:tc>
+        <w:tc>
+          <w:tcPr>
+            <w:tcW w:type="dxa" w:w="2160"/>
+          </w:tcPr>
+          <w:p>
+            <w:r>
+              <w:t>$50</w:t>
+            </w:r>
+          </w:p>
+        </w:tc>
+      </w:tr>
+      <w:tr>
+        <w:tc>
+          <w:tcPr>
+            <w:tcW w:type="dxa" w:w="2160"/>
+          </w:tcPr>
+          <w:p>
+            <w:r>
+              <w:t>Vitamin B-12 Injection</w:t>
+            </w:r>
+          </w:p>
+        </w:tc>
+        <w:tc>
+          <w:tcPr>
+            <w:tcW w:type="dxa" w:w="2160"/>
+          </w:tcPr>
+          <w:p>
+            <w:r>
+              <w:t>IV &amp; Vitamins</w:t>
+            </w:r>
+          </w:p>
+        </w:tc>
+        <w:tc>
+          <w:tcPr>
+            <w:tcW w:type="dxa" w:w="2160"/>
+          </w:tcPr>
+          <w:p>
+            <w:r>
+              <w:t>$8</w:t>
+            </w:r>
+          </w:p>
+        </w:tc>
+        <w:tc>
+          <w:tcPr>
+            <w:tcW w:type="dxa" w:w="2160"/>
+          </w:tcPr>
+          <w:p>
+            <w:r>
+              <w:t>$30</w:t>
+            </w:r>
+          </w:p>
+        </w:tc>
+      </w:tr>
+      <w:tr>
+        <w:tc>
+          <w:tcPr>
+            <w:tcW w:type="dxa" w:w="2160"/>
+          </w:tcPr>
+          <w:p>
+            <w:r>
+              <w:t>IV Vitamin Therapy</w:t>
+            </w:r>
+          </w:p>
+        </w:tc>
+        <w:tc>
+          <w:tcPr>
+            <w:tcW w:type="dxa" w:w="2160"/>
+          </w:tcPr>
+          <w:p>
+            <w:r>
+              <w:t>IV &amp; Vitamins</w:t>
+            </w:r>
+          </w:p>
+        </w:tc>
+        <w:tc>
+          <w:tcPr>
+            <w:tcW w:type="dxa" w:w="2160"/>
+          </w:tcPr>
+          <w:p>
+            <w:r>
+              <w:t>$40</w:t>
+            </w:r>
+          </w:p>
+        </w:tc>
+        <w:tc>
+          <w:tcPr>
+            <w:tcW w:type="dxa" w:w="2160"/>
+          </w:tcPr>
+          <w:p>
+            <w:r>
+              <w:t>$150</w:t>
+            </w:r>
+          </w:p>
+        </w:tc>
+      </w:tr>
+      <w:tr>
+        <w:tc>
+          <w:tcPr>
+            <w:tcW w:type="dxa" w:w="2160"/>
+          </w:tcPr>
+          <w:p>
+            <w:r>
+              <w:t>Botox (per area)</w:t>
+            </w:r>
+          </w:p>
+        </w:tc>
+        <w:tc>
+          <w:tcPr>
+            <w:tcW w:type="dxa" w:w="2160"/>
+          </w:tcPr>
+          <w:p>
+            <w:r>
+              <w:t>Aesthetics</w:t>
+            </w:r>
+          </w:p>
+        </w:tc>
+        <w:tc>
+          <w:tcPr>
+            <w:tcW w:type="dxa" w:w="2160"/>
+          </w:tcPr>
+          <w:p>
+            <w:r>
+              <w:t>$80</w:t>
+            </w:r>
+          </w:p>
+        </w:tc>
+        <w:tc>
+          <w:tcPr>
+            <w:tcW w:type="dxa" w:w="2160"/>
+          </w:tcPr>
+          <w:p>
+            <w:r>
+              <w:t>$250</w:t>
+            </w:r>
+          </w:p>
+        </w:tc>
+      </w:tr>
+      <w:tr>
+        <w:tc>
+          <w:tcPr>
+            <w:tcW w:type="dxa" w:w="2160"/>
+          </w:tcPr>
+          <w:p>
+            <w:r>
+              <w:t>Dermal Fillers</w:t>
+            </w:r>
+          </w:p>
+        </w:tc>
+        <w:tc>
+          <w:tcPr>
+            <w:tcW w:type="dxa" w:w="2160"/>
+          </w:tcPr>
+          <w:p>
+            <w:r>
+              <w:t>Aesthetics</w:t>
+            </w:r>
+          </w:p>
+        </w:tc>
+        <w:tc>
+          <w:tcPr>
+            <w:tcW w:type="dxa" w:w="2160"/>
+          </w:tcPr>
+          <w:p>
+            <w:r>
+              <w:t>$120</w:t>
+            </w:r>
+          </w:p>
+        </w:tc>
+        <w:tc>
+          <w:tcPr>
+            <w:tcW w:type="dxa" w:w="2160"/>
+          </w:tcPr>
+          <w:p>
+            <w:r>
+              <w:t>$400</w:t>
+            </w:r>
+          </w:p>
+        </w:tc>
+      </w:tr>
+      <w:tr>
+        <w:tc>
+          <w:tcPr>
+            <w:tcW w:type="dxa" w:w="2160"/>
+          </w:tcPr>
+          <w:p>
+            <w:r>
+              <w:t>RF Microneedling (Morpheus8)</w:t>
+            </w:r>
+          </w:p>
+        </w:tc>
+        <w:tc>
+          <w:tcPr>
+            <w:tcW w:type="dxa" w:w="2160"/>
+          </w:tcPr>
+          <w:p>
+            <w:r>
+              <w:t>Aesthetics</w:t>
+            </w:r>
+          </w:p>
+        </w:tc>
+        <w:tc>
+          <w:tcPr>
+            <w:tcW w:type="dxa" w:w="2160"/>
+          </w:tcPr>
+          <w:p>
+            <w:r>
+              <w:t>$150</w:t>
+            </w:r>
+          </w:p>
+        </w:tc>
+        <w:tc>
+          <w:tcPr>
+            <w:tcW w:type="dxa" w:w="2160"/>
+          </w:tcPr>
+          <w:p>
+            <w:r>
+              <w:t>$500</w:t>
+            </w:r>
+          </w:p>
+        </w:tc>
+      </w:tr>
+      <w:tr>
+        <w:tc>
+          <w:tcPr>
+            <w:tcW w:type="dxa" w:w="2160"/>
+          </w:tcPr>
+          <w:p>
+            <w:r>
+              <w:t>IPL / Lumecca</w:t>
+            </w:r>
+          </w:p>
+        </w:tc>
+        <w:tc>
+          <w:tcPr>
+            <w:tcW w:type="dxa" w:w="2160"/>
+          </w:tcPr>
+          <w:p>
+            <w:r>
+              <w:t>Aesthetics</w:t>
+            </w:r>
+          </w:p>
+        </w:tc>
+        <w:tc>
+          <w:tcPr>
+            <w:tcW w:type="dxa" w:w="2160"/>
+          </w:tcPr>
+          <w:p>
+            <w:r>
+              <w:t>$90</w:t>
+            </w:r>
+          </w:p>
+        </w:tc>
+        <w:tc>
+          <w:tcPr>
+            <w:tcW w:type="dxa" w:w="2160"/>
+          </w:tcPr>
+          <w:p>
+            <w:r>
+              <w:t>$300</w:t>
+            </w:r>
+          </w:p>
+        </w:tc>
+      </w:tr>
+      <w:tr>
+        <w:tc>
+          <w:tcPr>
+            <w:tcW w:type="dxa" w:w="2160"/>
+          </w:tcPr>
+          <w:p>
+            <w:r>
+              <w:t>Laser Hair Removal</w:t>
+            </w:r>
+          </w:p>
+        </w:tc>
+        <w:tc>
+          <w:tcPr>
+            <w:tcW w:type="dxa" w:w="2160"/>
+          </w:tcPr>
+          <w:p>
+            <w:r>
+              <w:t>Aesthetics</w:t>
+            </w:r>
+          </w:p>
+        </w:tc>
+        <w:tc>
+          <w:tcPr>
+            <w:tcW w:type="dxa" w:w="2160"/>
+          </w:tcPr>
+          <w:p>
+            <w:r>
+              <w:t>$60</w:t>
+            </w:r>
+          </w:p>
+        </w:tc>
+        <w:tc>
+          <w:tcPr>
+            <w:tcW w:type="dxa" w:w="2160"/>
+          </w:tcPr>
+          <w:p>
+            <w:r>
+              <w:t>$200</w:t>
+            </w:r>
+          </w:p>
+        </w:tc>
+      </w:tr>
+      <w:tr>
+        <w:tc>
+          <w:tcPr>
+            <w:tcW w:type="dxa" w:w="2160"/>
+          </w:tcPr>
+          <w:p>
+            <w:r>
+              <w:t>Chemical Peel</w:t>
+            </w:r>
+          </w:p>
+        </w:tc>
+        <w:tc>
+          <w:tcPr>
+            <w:tcW w:type="dxa" w:w="2160"/>
+          </w:tcPr>
+          <w:p>
+            <w:r>
+              <w:t>Aesthetics</w:t>
+            </w:r>
+          </w:p>
+        </w:tc>
+        <w:tc>
+          <w:tcPr>
+            <w:tcW w:type="dxa" w:w="2160"/>
+          </w:tcPr>
+          <w:p>
+            <w:r>
+              <w:t>$35</w:t>
+            </w:r>
+          </w:p>
+        </w:tc>
+        <w:tc>
+          <w:tcPr>
+            <w:tcW w:type="dxa" w:w="2160"/>
+          </w:tcPr>
+          <w:p>
+            <w:r>
+              <w:t>$120</w:t>
+            </w:r>
+          </w:p>
+        </w:tc>
+      </w:tr>
+      <w:tr>
+        <w:tc>
+          <w:tcPr>
+            <w:tcW w:type="dxa" w:w="2160"/>
+          </w:tcPr>
+          <w:p>
+            <w:r>
+              <w:t>Facial</w:t>
+            </w:r>
+          </w:p>
+        </w:tc>
+        <w:tc>
+          <w:tcPr>
+            <w:tcW w:type="dxa" w:w="2160"/>
+          </w:tcPr>
+          <w:p>
+            <w:r>
+              <w:t>Aesthetics</w:t>
+            </w:r>
+          </w:p>
+        </w:tc>
+        <w:tc>
+          <w:tcPr>
+            <w:tcW w:type="dxa" w:w="2160"/>
+          </w:tcPr>
+          <w:p>
+            <w:r>
+              <w:t>$30</w:t>
+            </w:r>
+          </w:p>
+        </w:tc>
+        <w:tc>
+          <w:tcPr>
+            <w:tcW w:type="dxa" w:w="2160"/>
+          </w:tcPr>
+          <w:p>
+            <w:r>
+              <w:t>$100</w:t>
+            </w:r>
+          </w:p>
+        </w:tc>
+      </w:tr>
+      <w:tr>
+        <w:tc>
+          <w:tcPr>
+            <w:tcW w:type="dxa" w:w="2160"/>
+          </w:tcPr>
+          <w:p>
+            <w:r>
+              <w:t>Body Contouring</w:t>
+            </w:r>
+          </w:p>
+        </w:tc>
+        <w:tc>
+          <w:tcPr>
+            <w:tcW w:type="dxa" w:w="2160"/>
+          </w:tcPr>
+          <w:p>
+            <w:r>
+              <w:t>Aesthetics</w:t>
+            </w:r>
+          </w:p>
+        </w:tc>
+        <w:tc>
+          <w:tcPr>
+            <w:tcW w:type="dxa" w:w="2160"/>
+          </w:tcPr>
+          <w:p>
+            <w:r>
+              <w:t>$100</w:t>
+            </w:r>
+          </w:p>
+        </w:tc>
+        <w:tc>
+          <w:tcPr>
+            <w:tcW w:type="dxa" w:w="2160"/>
+          </w:tcPr>
+          <w:p>
+            <w:r>
+              <w:t>$350</w:t>
+            </w:r>
+          </w:p>
+        </w:tc>
+      </w:tr>
+      <w:tr>
+        <w:tc>
+          <w:tcPr>
+            <w:tcW w:type="dxa" w:w="2160"/>
+          </w:tcPr>
+          <w:p>
+            <w:r>
+              <w:t>HRT Consultation</w:t>
+            </w:r>
+          </w:p>
+        </w:tc>
+        <w:tc>
+          <w:tcPr>
+            <w:tcW w:type="dxa" w:w="2160"/>
+          </w:tcPr>
+          <w:p>
+            <w:r>
+              <w:t>Hormones</w:t>
+            </w:r>
+          </w:p>
+        </w:tc>
+        <w:tc>
+          <w:tcPr>
+            <w:tcW w:type="dxa" w:w="2160"/>
+          </w:tcPr>
+          <w:p>
+            <w:r>
+              <w:t>$30</w:t>
+            </w:r>
+          </w:p>
+        </w:tc>
+        <w:tc>
+          <w:tcPr>
+            <w:tcW w:type="dxa" w:w="2160"/>
+          </w:tcPr>
+          <w:p>
+            <w:r>
+              <w:t>$100</w:t>
+            </w:r>
+          </w:p>
+        </w:tc>
+      </w:tr>
+      <w:tr>
+        <w:tc>
+          <w:tcPr>
+            <w:tcW w:type="dxa" w:w="2160"/>
+          </w:tcPr>
+          <w:p>
+            <w:r>
+              <w:t>Testosterone Replacement</w:t>
+            </w:r>
+          </w:p>
+        </w:tc>
+        <w:tc>
+          <w:tcPr>
+            <w:tcW w:type="dxa" w:w="2160"/>
+          </w:tcPr>
+          <w:p>
+            <w:r>
+              <w:t>Hormones</w:t>
+            </w:r>
+          </w:p>
+        </w:tc>
+        <w:tc>
+          <w:tcPr>
+            <w:tcW w:type="dxa" w:w="2160"/>
+          </w:tcPr>
+          <w:p>
+            <w:r>
+              <w:t>$45</w:t>
+            </w:r>
+          </w:p>
+        </w:tc>
+        <w:tc>
+          <w:tcPr>
+            <w:tcW w:type="dxa" w:w="2160"/>
+          </w:tcPr>
+          <w:p>
+            <w:r>
+              <w:t>$150</w:t>
+            </w:r>
+          </w:p>
+        </w:tc>
+      </w:tr>
+      <w:tr>
+        <w:tc>
+          <w:tcPr>
+            <w:tcW w:type="dxa" w:w="2160"/>
+          </w:tcPr>
+          <w:p>
+            <w:r>
+              <w:t>BHRT / Menopause Treatment</w:t>
+            </w:r>
+          </w:p>
+        </w:tc>
+        <w:tc>
+          <w:tcPr>
+            <w:tcW w:type="dxa" w:w="2160"/>
+          </w:tcPr>
+          <w:p>
+            <w:r>
+              <w:t>Hormones</w:t>
+            </w:r>
+          </w:p>
+        </w:tc>
+        <w:tc>
+          <w:tcPr>
+            <w:tcW w:type="dxa" w:w="2160"/>
+          </w:tcPr>
+          <w:p>
+            <w:r>
+              <w:t>$50</w:t>
+            </w:r>
+          </w:p>
+        </w:tc>
+        <w:tc>
+          <w:tcPr>
+            <w:tcW w:type="dxa" w:w="2160"/>
+          </w:tcPr>
+          <w:p>
+            <w:r>
+              <w:t>$175</w:t>
+            </w:r>
+          </w:p>
+        </w:tc>
+      </w:tr>
+      <w:tr>
+        <w:tc>
+          <w:tcPr>
+            <w:tcW w:type="dxa" w:w="2160"/>
+          </w:tcPr>
+          <w:p>
+            <w:r>
+              <w:t>GLP-1 Medication</w:t>
+            </w:r>
+          </w:p>
+        </w:tc>
+        <w:tc>
+          <w:tcPr>
+            <w:tcW w:type="dxa" w:w="2160"/>
+          </w:tcPr>
+          <w:p>
+            <w:r>
+              <w:t>Weight Loss</w:t>
+            </w:r>
+          </w:p>
+        </w:tc>
+        <w:tc>
+          <w:tcPr>
+            <w:tcW w:type="dxa" w:w="2160"/>
+          </w:tcPr>
+          <w:p>
+            <w:r>
+              <w:t>$80</w:t>
+            </w:r>
+          </w:p>
+        </w:tc>
+        <w:tc>
+          <w:tcPr>
+            <w:tcW w:type="dxa" w:w="2160"/>
+          </w:tcPr>
+          <w:p>
+            <w:r>
+              <w:t>$250</w:t>
+            </w:r>
+          </w:p>
+        </w:tc>
+      </w:tr>
+      <w:tr>
+        <w:tc>
+          <w:tcPr>
+            <w:tcW w:type="dxa" w:w="2160"/>
+          </w:tcPr>
+          <w:p>
+            <w:r>
+              <w:t>Nutritionist Consultation</w:t>
+            </w:r>
+          </w:p>
+        </w:tc>
+        <w:tc>
+          <w:tcPr>
+            <w:tcW w:type="dxa" w:w="2160"/>
+          </w:tcPr>
+          <w:p>
+            <w:r>
+              <w:t>Weight Loss</w:t>
+            </w:r>
+          </w:p>
+        </w:tc>
+        <w:tc>
+          <w:tcPr>
+            <w:tcW w:type="dxa" w:w="2160"/>
+          </w:tcPr>
+          <w:p>
+            <w:r>
+              <w:t>$25</w:t>
+            </w:r>
+          </w:p>
+        </w:tc>
+        <w:tc>
+          <w:tcPr>
+            <w:tcW w:type="dxa" w:w="2160"/>
+          </w:tcPr>
+          <w:p>
+            <w:r>
+              <w:t>$85</w:t>
+            </w:r>
+          </w:p>
+        </w:tc>
+      </w:tr>
+      <w:tr>
+        <w:tc>
+          <w:tcPr>
+            <w:tcW w:type="dxa" w:w="2160"/>
+          </w:tcPr>
+          <w:p>
+            <w:r>
+              <w:t>Personal Training Session</w:t>
+            </w:r>
+          </w:p>
+        </w:tc>
+        <w:tc>
+          <w:tcPr>
+            <w:tcW w:type="dxa" w:w="2160"/>
+          </w:tcPr>
+          <w:p>
+            <w:r>
+              <w:t>Weight Loss</w:t>
+            </w:r>
+          </w:p>
+        </w:tc>
+        <w:tc>
+          <w:tcPr>
+            <w:tcW w:type="dxa" w:w="2160"/>
+          </w:tcPr>
+          <w:p>
+            <w:r>
+              <w:t>$20</w:t>
+            </w:r>
+          </w:p>
+        </w:tc>
+        <w:tc>
+          <w:tcPr>
+            <w:tcW w:type="dxa" w:w="2160"/>
+          </w:tcPr>
+          <w:p>
+            <w:r>
+              <w:t>$65</w:t>
+            </w:r>
+          </w:p>
+        </w:tc>
+      </w:tr>
+      <w:tr>
+        <w:tc>
+          <w:tcPr>
+            <w:tcW w:type="dxa" w:w="2160"/>
+          </w:tcPr>
+          <w:p>
+            <w:r>
+              <w:t>Body Composition Analysis</w:t>
+            </w:r>
+          </w:p>
+        </w:tc>
+        <w:tc>
+          <w:tcPr>
+            <w:tcW w:type="dxa" w:w="2160"/>
+          </w:tcPr>
+          <w:p>
+            <w:r>
+              <w:t>Weight Loss</w:t>
+            </w:r>
+          </w:p>
+        </w:tc>
+        <w:tc>
+          <w:tcPr>
+            <w:tcW w:type="dxa" w:w="2160"/>
+          </w:tcPr>
+          <w:p>
+            <w:r>
+              <w:t>$15</w:t>
+            </w:r>
+          </w:p>
+        </w:tc>
+        <w:tc>
+          <w:tcPr>
+            <w:tcW w:type="dxa" w:w="2160"/>
+          </w:tcPr>
+          <w:p>
+            <w:r>
+              <w:t>$50</w:t>
+            </w:r>
+          </w:p>
+        </w:tc>
+      </w:tr>
+      <w:tr>
+        <w:tc>
+          <w:tcPr>
+            <w:tcW w:type="dxa" w:w="2160"/>
+          </w:tcPr>
+          <w:p>
+            <w:r>
+              <w:t>Sexual Health / ED Treatment</w:t>
+            </w:r>
+          </w:p>
+        </w:tc>
+        <w:tc>
+          <w:tcPr>
+            <w:tcW w:type="dxa" w:w="2160"/>
+          </w:tcPr>
+          <w:p>
+            <w:r>
+              <w:t>Hormones</w:t>
+            </w:r>
+          </w:p>
+        </w:tc>
+        <w:tc>
+          <w:tcPr>
+            <w:tcW w:type="dxa" w:w="2160"/>
+          </w:tcPr>
+          <w:p>
+            <w:r>
+              <w:t>$35</w:t>
+            </w:r>
+          </w:p>
+        </w:tc>
+        <w:tc>
+          <w:tcPr>
+            <w:tcW w:type="dxa" w:w="2160"/>
+          </w:tcPr>
+          <w:p>
+            <w:r>
+              <w:t>$125</w:t>
+            </w:r>
+          </w:p>
+        </w:tc>
+      </w:tr>
+    </w:tbl>
+    <w:p/>
+    <w:p>
+      <w:pPr>
+        <w:pStyle w:val="Heading1"/>
+      </w:pPr>
+      <w:r>
+        <w:t>2. Packages (Service Bundles)</w:t>
+      </w:r>
+    </w:p>
+    <w:p>
+      <w:r>
+        <w:rPr>
+          <w:i/>
+        </w:rPr>
+        <w:t>Bundles of services sold as a single purchase. NOT connected to memberships — completely independent.</w:t>
+      </w:r>
+    </w:p>
+    <w:p/>
+    <w:tbl>
+      <w:tblPr>
+        <w:tblStyle w:val="MediumShading1-Accent1"/>
+        <w:tblW w:type="auto" w:w="0"/>
+        <w:jc w:val="center"/>
+        <w:tblLook w:firstColumn="1" w:firstRow="1" w:lastColumn="0" w:lastRow="0" w:noHBand="0" w:noVBand="1" w:val="04A0"/>
+      </w:tblPr>
+      <w:tblGrid>
+        <w:gridCol w:w="2160"/>
+        <w:gridCol w:w="2160"/>
+        <w:gridCol w:w="2160"/>
+        <w:gridCol w:w="2160"/>
+      </w:tblGrid>
+      <w:tr>
+        <w:tc>
+          <w:tcPr>
+            <w:tcW w:type="dxa" w:w="2160"/>
+          </w:tcPr>
+          <w:p>
+            <w:r>
+              <w:rPr>
+                <w:b/>
+              </w:rPr>
+              <w:t>Package</w:t>
+            </w:r>
+          </w:p>
+        </w:tc>
+        <w:tc>
+          <w:tcPr>
+            <w:tcW w:type="dxa" w:w="2160"/>
+          </w:tcPr>
+          <w:p>
+            <w:r>
+              <w:rPr>
+                <w:b/>
+              </w:rPr>
+              <w:t>Price</w:t>
+            </w:r>
+          </w:p>
+        </w:tc>
+        <w:tc>
+          <w:tcPr>
+            <w:tcW w:type="dxa" w:w="2160"/>
+          </w:tcPr>
+          <w:p>
+            <w:r>
+              <w:rPr>
+                <w:b/>
+              </w:rPr>
+              <w:t>Cost</w:t>
+            </w:r>
+          </w:p>
+        </w:tc>
+        <w:tc>
+          <w:tcPr>
+            <w:tcW w:type="dxa" w:w="2160"/>
+          </w:tcPr>
+          <w:p>
+            <w:r>
+              <w:rPr>
+                <w:b/>
+              </w:rPr>
+              <w:t>Margin</w:t>
+            </w:r>
+          </w:p>
+        </w:tc>
+      </w:tr>
+      <w:tr>
+        <w:tc>
+          <w:tcPr>
+            <w:tcW w:type="dxa" w:w="2160"/>
+          </w:tcPr>
+          <w:p>
+            <w:r>
+              <w:t>Weight Loss Kickstart</w:t>
+            </w:r>
+          </w:p>
+        </w:tc>
+        <w:tc>
+          <w:tcPr>
+            <w:tcW w:type="dxa" w:w="2160"/>
+          </w:tcPr>
+          <w:p>
+            <w:r>
+              <w:t>$699</w:t>
+            </w:r>
+          </w:p>
+        </w:tc>
+        <w:tc>
+          <w:tcPr>
+            <w:tcW w:type="dxa" w:w="2160"/>
+          </w:tcPr>
+          <w:p>
+            <w:r>
+              <w:t>$280</w:t>
+            </w:r>
+          </w:p>
+        </w:tc>
+        <w:tc>
+          <w:tcPr>
+            <w:tcW w:type="dxa" w:w="2160"/>
+          </w:tcPr>
+          <w:p>
+            <w:r>
+              <w:t>59.9%</w:t>
+            </w:r>
+          </w:p>
+        </w:tc>
+      </w:tr>
+      <w:tr>
+        <w:tc>
+          <w:tcPr>
+            <w:tcW w:type="dxa" w:w="2160"/>
+          </w:tcPr>
+          <w:p>
+            <w:r>
+              <w:t>Weight Loss Accelerator</w:t>
+            </w:r>
+          </w:p>
+        </w:tc>
+        <w:tc>
+          <w:tcPr>
+            <w:tcW w:type="dxa" w:w="2160"/>
+          </w:tcPr>
+          <w:p>
+            <w:r>
+              <w:t>$1,299</w:t>
+            </w:r>
+          </w:p>
+        </w:tc>
+        <w:tc>
+          <w:tcPr>
+            <w:tcW w:type="dxa" w:w="2160"/>
+          </w:tcPr>
+          <w:p>
+            <w:r>
+              <w:t>$520</w:t>
+            </w:r>
+          </w:p>
+        </w:tc>
+        <w:tc>
+          <w:tcPr>
+            <w:tcW w:type="dxa" w:w="2160"/>
+          </w:tcPr>
+          <w:p>
+            <w:r>
+              <w:t>60.0%</w:t>
+            </w:r>
+          </w:p>
+        </w:tc>
+      </w:tr>
+      <w:tr>
+        <w:tc>
+          <w:tcPr>
+            <w:tcW w:type="dxa" w:w="2160"/>
+          </w:tcPr>
+          <w:p>
+            <w:r>
+              <w:t>Glow Up</w:t>
+            </w:r>
+          </w:p>
+        </w:tc>
+        <w:tc>
+          <w:tcPr>
+            <w:tcW w:type="dxa" w:w="2160"/>
+          </w:tcPr>
+          <w:p>
+            <w:r>
+              <w:t>$899</w:t>
+            </w:r>
+          </w:p>
+        </w:tc>
+        <w:tc>
+          <w:tcPr>
+            <w:tcW w:type="dxa" w:w="2160"/>
+          </w:tcPr>
+          <w:p>
+            <w:r>
+              <w:t>$350</w:t>
+            </w:r>
+          </w:p>
+        </w:tc>
+        <w:tc>
+          <w:tcPr>
+            <w:tcW w:type="dxa" w:w="2160"/>
+          </w:tcPr>
+          <w:p>
+            <w:r>
+              <w:t>61.1%</w:t>
+            </w:r>
+          </w:p>
+        </w:tc>
+      </w:tr>
+      <w:tr>
+        <w:tc>
+          <w:tcPr>
+            <w:tcW w:type="dxa" w:w="2160"/>
+          </w:tcPr>
+          <w:p>
+            <w:r>
+              <w:t>Total Body Reset</w:t>
+            </w:r>
+          </w:p>
+        </w:tc>
+        <w:tc>
+          <w:tcPr>
+            <w:tcW w:type="dxa" w:w="2160"/>
+          </w:tcPr>
+          <w:p>
+            <w:r>
+              <w:t>$1,699</w:t>
+            </w:r>
+          </w:p>
+        </w:tc>
+        <w:tc>
+          <w:tcPr>
+            <w:tcW w:type="dxa" w:w="2160"/>
+          </w:tcPr>
+          <w:p>
+            <w:r>
+              <w:t>$680</w:t>
+            </w:r>
+          </w:p>
+        </w:tc>
+        <w:tc>
+          <w:tcPr>
+            <w:tcW w:type="dxa" w:w="2160"/>
+          </w:tcPr>
+          <w:p>
+            <w:r>
+              <w:t>60.0%</w:t>
+            </w:r>
+          </w:p>
+        </w:tc>
+      </w:tr>
+    </w:tbl>
+    <w:p/>
+    <w:p>
+      <w:pPr>
+        <w:pStyle w:val="Heading2"/>
+      </w:pPr>
+      <w:r>
+        <w:t>Weight Loss Kickstart — $699</w:t>
+      </w:r>
+    </w:p>
+    <w:p>
+      <w:pPr>
+        <w:pStyle w:val="ListBullet"/>
+      </w:pPr>
+      <w:r>
+        <w:t>GLP-1 Medication (1 month)</w:t>
+      </w:r>
+    </w:p>
+    <w:p>
+      <w:pPr>
+        <w:pStyle w:val="ListBullet"/>
+      </w:pPr>
+      <w:r>
+        <w:t>4x Accountability consultations</w:t>
+      </w:r>
+    </w:p>
+    <w:p>
+      <w:pPr>
+        <w:pStyle w:val="ListBullet"/>
+      </w:pPr>
+      <w:r>
+        <w:t>2x Nutritionist meal planning sessions</w:t>
+      </w:r>
+    </w:p>
+    <w:p>
+      <w:pPr>
+        <w:pStyle w:val="ListBullet"/>
+      </w:pPr>
+      <w:r>
+        <w:t>4x Personal training sessions</w:t>
+      </w:r>
+    </w:p>
+    <w:p>
+      <w:pPr>
+        <w:pStyle w:val="ListBullet"/>
+      </w:pPr>
+      <w:r>
+        <w:t>Body composition analysis</w:t>
+      </w:r>
+    </w:p>
+    <w:p>
+      <w:pPr>
+        <w:pStyle w:val="ListBullet"/>
+      </w:pPr>
+      <w:r>
+        <w:t>Weight loss supplement bundle</w:t>
+      </w:r>
+    </w:p>
+    <w:p/>
+    <w:p>
+      <w:pPr>
+        <w:pStyle w:val="Heading2"/>
+      </w:pPr>
+      <w:r>
+        <w:t>Weight Loss Accelerator — $1,299</w:t>
+      </w:r>
+    </w:p>
+    <w:p>
+      <w:pPr>
+        <w:pStyle w:val="ListBullet"/>
+      </w:pPr>
+      <w:r>
+        <w:t>GLP-1 Medication (3 months)</w:t>
+      </w:r>
+    </w:p>
+    <w:p>
+      <w:pPr>
+        <w:pStyle w:val="ListBullet"/>
+      </w:pPr>
+      <w:r>
+        <w:t>12x Weekly accountability consultations</w:t>
+      </w:r>
+    </w:p>
+    <w:p>
+      <w:pPr>
+        <w:pStyle w:val="ListBullet"/>
+      </w:pPr>
+      <w:r>
+        <w:t>6x Bi-weekly check-in meetings</w:t>
+      </w:r>
+    </w:p>
+    <w:p>
+      <w:pPr>
+        <w:pStyle w:val="ListBullet"/>
+      </w:pPr>
+      <w:r>
+        <w:t>6x Nutritionist sessions</w:t>
+      </w:r>
+    </w:p>
+    <w:p>
+      <w:pPr>
+        <w:pStyle w:val="ListBullet"/>
+      </w:pPr>
+      <w:r>
+        <w:t>12x Personal training sessions</w:t>
+      </w:r>
+    </w:p>
+    <w:p>
+      <w:pPr>
+        <w:pStyle w:val="ListBullet"/>
+      </w:pPr>
+      <w:r>
+        <w:t>3x Progress labs &amp; body comp</w:t>
+      </w:r>
+    </w:p>
+    <w:p>
+      <w:pPr>
+        <w:pStyle w:val="ListBullet"/>
+      </w:pPr>
+      <w:r>
+        <w:t>Weight loss supplement bundle</w:t>
+      </w:r>
+    </w:p>
+    <w:p/>
+    <w:p>
+      <w:pPr>
+        <w:pStyle w:val="Heading2"/>
+      </w:pPr>
+      <w:r>
+        <w:t>Glow Up — $899</w:t>
+      </w:r>
+    </w:p>
+    <w:p>
+      <w:pPr>
+        <w:pStyle w:val="ListBullet"/>
+      </w:pPr>
+      <w:r>
+        <w:t>2x Botox sessions</w:t>
+      </w:r>
+    </w:p>
+    <w:p>
+      <w:pPr>
+        <w:pStyle w:val="ListBullet"/>
+      </w:pPr>
+      <w:r>
+        <w:t>1x Dermal filler session</w:t>
+      </w:r>
+    </w:p>
+    <w:p>
+      <w:pPr>
+        <w:pStyle w:val="ListBullet"/>
+      </w:pPr>
+      <w:r>
+        <w:t>2x Chemical peels</w:t>
+      </w:r>
+    </w:p>
+    <w:p>
+      <w:pPr>
+        <w:pStyle w:val="ListBullet"/>
+      </w:pPr>
+      <w:r>
+        <w:t>2x Facials</w:t>
+      </w:r>
+    </w:p>
+    <w:p/>
+    <w:p>
+      <w:pPr>
+        <w:pStyle w:val="Heading2"/>
+      </w:pPr>
+      <w:r>
+        <w:t>Total Body Reset — $1,699</w:t>
+      </w:r>
+    </w:p>
+    <w:p>
+      <w:pPr>
+        <w:pStyle w:val="ListBullet"/>
+      </w:pPr>
+      <w:r>
+        <w:t>GLP-1 Medication (3 months)</w:t>
+      </w:r>
+    </w:p>
+    <w:p>
+      <w:pPr>
+        <w:pStyle w:val="ListBullet"/>
+      </w:pPr>
+      <w:r>
+        <w:t>12x Accountability consultations</w:t>
+      </w:r>
+    </w:p>
+    <w:p>
+      <w:pPr>
+        <w:pStyle w:val="ListBullet"/>
+      </w:pPr>
+      <w:r>
+        <w:t>6x Personal training sessions</w:t>
+      </w:r>
+    </w:p>
+    <w:p>
+      <w:pPr>
+        <w:pStyle w:val="ListBullet"/>
+      </w:pPr>
+      <w:r>
+        <w:t>3x Body contouring sessions</w:t>
+      </w:r>
+    </w:p>
+    <w:p>
+      <w:pPr>
+        <w:pStyle w:val="ListBullet"/>
+      </w:pPr>
+      <w:r>
+        <w:t>3x Progress labs &amp; body comp</w:t>
+      </w:r>
+    </w:p>
+    <w:p>
+      <w:pPr>
+        <w:pStyle w:val="ListBullet"/>
+      </w:pPr>
+      <w:r>
+        <w:t>Nutritionist meal plan</w:t>
+      </w:r>
+    </w:p>
+    <w:p/>
+    <w:p>
+      <w:pPr>
+        <w:pStyle w:val="Heading1"/>
+      </w:pPr>
+      <w:r>
+        <w:t>3. Memberships (Recurring Monthly)</w:t>
+      </w:r>
+    </w:p>
+    <w:p>
+      <w:r>
+        <w:rPr>
+          <w:i/>
+        </w:rPr>
+        <w:t>Monthly plans that include credits, services, and products. Starter fee charged at sign-up.</w:t>
+      </w:r>
+    </w:p>
+    <w:p/>
+    <w:tbl>
+      <w:tblPr>
+        <w:tblStyle w:val="MediumShading1-Accent1"/>
+        <w:tblW w:type="auto" w:w="0"/>
+        <w:jc w:val="center"/>
+        <w:tblLook w:firstColumn="1" w:firstRow="1" w:lastColumn="0" w:lastRow="0" w:noHBand="0" w:noVBand="1" w:val="04A0"/>
+      </w:tblPr>
+      <w:tblGrid>
+        <w:gridCol w:w="1440"/>
+        <w:gridCol w:w="1440"/>
+        <w:gridCol w:w="1440"/>
+        <w:gridCol w:w="1440"/>
+        <w:gridCol w:w="1440"/>
+        <w:gridCol w:w="1440"/>
+      </w:tblGrid>
+      <w:tr>
+        <w:tc>
+          <w:tcPr>
+            <w:tcW w:type="dxa" w:w="1440"/>
           </w:tcPr>
           <w:p>
             <w:r>
@@ -62,7 +1484,7 @@
         </w:tc>
         <w:tc>
           <w:tcPr>
-            <w:tcW w:type="dxa" w:w="1728"/>
+            <w:tcW w:type="dxa" w:w="1440"/>
           </w:tcPr>
           <w:p>
             <w:r>
@@ -75,7 +1497,7 @@
         </w:tc>
         <w:tc>
           <w:tcPr>
-            <w:tcW w:type="dxa" w:w="1728"/>
+            <w:tcW w:type="dxa" w:w="1440"/>
           </w:tcPr>
           <w:p>
             <w:r>
@@ -88,27 +1510,40 @@
         </w:tc>
         <w:tc>
           <w:tcPr>
-            <w:tcW w:type="dxa" w:w="1728"/>
+            <w:tcW w:type="dxa" w:w="1440"/>
           </w:tcPr>
           <w:p>
             <w:r>
               <w:rPr>
                 <w:b/>
               </w:rPr>
-              <w:t>Monthly Price</w:t>
+              <w:t>Monthly</w:t>
             </w:r>
           </w:p>
         </w:tc>
         <w:tc>
           <w:tcPr>
-            <w:tcW w:type="dxa" w:w="1728"/>
+            <w:tcW w:type="dxa" w:w="1440"/>
           </w:tcPr>
           <w:p>
             <w:r>
               <w:rPr>
                 <w:b/>
               </w:rPr>
-              <w:t>Key Focus</w:t>
+              <w:t>Credits/Mo</w:t>
+            </w:r>
+          </w:p>
+        </w:tc>
+        <w:tc>
+          <w:tcPr>
+            <w:tcW w:type="dxa" w:w="1440"/>
+          </w:tcPr>
+          <w:p>
+            <w:r>
+              <w:rPr>
+                <w:b/>
+              </w:rPr>
+              <w:t>Margin</w:t>
             </w:r>
           </w:p>
         </w:tc>
@@ -116,7 +1551,7 @@
       <w:tr>
         <w:tc>
           <w:tcPr>
-            <w:tcW w:type="dxa" w:w="1728"/>
+            <w:tcW w:type="dxa" w:w="1440"/>
           </w:tcPr>
           <w:p>
             <w:r>
@@ -126,7 +1561,7 @@
         </w:tc>
         <w:tc>
           <w:tcPr>
-            <w:tcW w:type="dxa" w:w="1728"/>
+            <w:tcW w:type="dxa" w:w="1440"/>
           </w:tcPr>
           <w:p>
             <w:r>
@@ -136,7 +1571,7 @@
         </w:tc>
         <w:tc>
           <w:tcPr>
-            <w:tcW w:type="dxa" w:w="1728"/>
+            <w:tcW w:type="dxa" w:w="1440"/>
           </w:tcPr>
           <w:p>
             <w:r>
@@ -146,7 +1581,7 @@
         </w:tc>
         <w:tc>
           <w:tcPr>
-            <w:tcW w:type="dxa" w:w="1728"/>
+            <w:tcW w:type="dxa" w:w="1440"/>
           </w:tcPr>
           <w:p>
             <w:r>
@@ -156,11 +1591,21 @@
         </w:tc>
         <w:tc>
           <w:tcPr>
-            <w:tcW w:type="dxa" w:w="1728"/>
+            <w:tcW w:type="dxa" w:w="1440"/>
           </w:tcPr>
           <w:p>
             <w:r>
-              <w:t>Core concierge medical access</w:t>
+              <w:t>2</w:t>
+            </w:r>
+          </w:p>
+        </w:tc>
+        <w:tc>
+          <w:tcPr>
+            <w:tcW w:type="dxa" w:w="1440"/>
+          </w:tcPr>
+          <w:p>
+            <w:r>
+              <w:t>69.8%</w:t>
             </w:r>
           </w:p>
         </w:tc>
@@ -168,27 +1613,27 @@
       <w:tr>
         <w:tc>
           <w:tcPr>
-            <w:tcW w:type="dxa" w:w="1728"/>
+            <w:tcW w:type="dxa" w:w="1440"/>
           </w:tcPr>
           <w:p>
             <w:r>
-              <w:t>Transform</w:t>
+              <w:t>Growth</w:t>
             </w:r>
           </w:p>
         </w:tc>
         <w:tc>
           <w:tcPr>
-            <w:tcW w:type="dxa" w:w="1728"/>
+            <w:tcW w:type="dxa" w:w="1440"/>
           </w:tcPr>
           <w:p>
             <w:r>
-              <w:t>Transform</w:t>
+              <w:t>Vitality</w:t>
             </w:r>
           </w:p>
         </w:tc>
         <w:tc>
           <w:tcPr>
-            <w:tcW w:type="dxa" w:w="1728"/>
+            <w:tcW w:type="dxa" w:w="1440"/>
           </w:tcPr>
           <w:p>
             <w:r>
@@ -198,21 +1643,31 @@
         </w:tc>
         <w:tc>
           <w:tcPr>
-            <w:tcW w:type="dxa" w:w="1728"/>
+            <w:tcW w:type="dxa" w:w="1440"/>
           </w:tcPr>
           <w:p>
             <w:r>
-              <w:t>$299/mo</w:t>
+              <w:t>$249/mo</w:t>
             </w:r>
           </w:p>
         </w:tc>
         <w:tc>
           <w:tcPr>
-            <w:tcW w:type="dxa" w:w="1728"/>
+            <w:tcW w:type="dxa" w:w="1440"/>
           </w:tcPr>
           <w:p>
             <w:r>
-              <w:t>Weight loss bundle</w:t>
+              <w:t>4</w:t>
+            </w:r>
+          </w:p>
+        </w:tc>
+        <w:tc>
+          <w:tcPr>
+            <w:tcW w:type="dxa" w:w="1440"/>
+          </w:tcPr>
+          <w:p>
+            <w:r>
+              <w:t>61.8%</w:t>
             </w:r>
           </w:p>
         </w:tc>
@@ -220,27 +1675,27 @@
       <w:tr>
         <w:tc>
           <w:tcPr>
-            <w:tcW w:type="dxa" w:w="1728"/>
+            <w:tcW w:type="dxa" w:w="1440"/>
           </w:tcPr>
           <w:p>
             <w:r>
-              <w:t>Growth</w:t>
+              <w:t>Scale</w:t>
             </w:r>
           </w:p>
         </w:tc>
         <w:tc>
           <w:tcPr>
-            <w:tcW w:type="dxa" w:w="1728"/>
+            <w:tcW w:type="dxa" w:w="1440"/>
           </w:tcPr>
           <w:p>
             <w:r>
-              <w:t>Vitality</w:t>
+              <w:t>Elite</w:t>
             </w:r>
           </w:p>
         </w:tc>
         <w:tc>
           <w:tcPr>
-            <w:tcW w:type="dxa" w:w="1728"/>
+            <w:tcW w:type="dxa" w:w="1440"/>
           </w:tcPr>
           <w:p>
             <w:r>
@@ -250,7 +1705,7 @@
         </w:tc>
         <w:tc>
           <w:tcPr>
-            <w:tcW w:type="dxa" w:w="1728"/>
+            <w:tcW w:type="dxa" w:w="1440"/>
           </w:tcPr>
           <w:p>
             <w:r>
@@ -260,11 +1715,21 @@
         </w:tc>
         <w:tc>
           <w:tcPr>
-            <w:tcW w:type="dxa" w:w="1728"/>
+            <w:tcW w:type="dxa" w:w="1440"/>
           </w:tcPr>
           <w:p>
             <w:r>
-              <w:t>Hormones + weight loss + wellness</w:t>
+              <w:t>8</w:t>
+            </w:r>
+          </w:p>
+        </w:tc>
+        <w:tc>
+          <w:tcPr>
+            <w:tcW w:type="dxa" w:w="1440"/>
+          </w:tcPr>
+          <w:p>
+            <w:r>
+              <w:t>59.9%</w:t>
             </w:r>
           </w:p>
         </w:tc>
@@ -272,17 +1737,17 @@
       <w:tr>
         <w:tc>
           <w:tcPr>
-            <w:tcW w:type="dxa" w:w="1728"/>
+            <w:tcW w:type="dxa" w:w="1440"/>
           </w:tcPr>
           <w:p>
             <w:r>
-              <w:t>Scale</w:t>
+              <w:t>VIP</w:t>
             </w:r>
           </w:p>
         </w:tc>
         <w:tc>
           <w:tcPr>
-            <w:tcW w:type="dxa" w:w="1728"/>
+            <w:tcW w:type="dxa" w:w="1440"/>
           </w:tcPr>
           <w:p>
             <w:r>
@@ -292,7 +1757,7 @@
         </w:tc>
         <w:tc>
           <w:tcPr>
-            <w:tcW w:type="dxa" w:w="1728"/>
+            <w:tcW w:type="dxa" w:w="1440"/>
           </w:tcPr>
           <w:p>
             <w:r>
@@ -302,7 +1767,7 @@
         </w:tc>
         <w:tc>
           <w:tcPr>
-            <w:tcW w:type="dxa" w:w="1728"/>
+            <w:tcW w:type="dxa" w:w="1440"/>
           </w:tcPr>
           <w:p>
             <w:r>
@@ -312,11 +1777,21 @@
         </w:tc>
         <w:tc>
           <w:tcPr>
-            <w:tcW w:type="dxa" w:w="1728"/>
+            <w:tcW w:type="dxa" w:w="1440"/>
           </w:tcPr>
           <w:p>
             <w:r>
-              <w:t>Full suite including aesthetics</w:t>
+              <w:t>Unlimited</w:t>
+            </w:r>
+          </w:p>
+        </w:tc>
+        <w:tc>
+          <w:tcPr>
+            <w:tcW w:type="dxa" w:w="1440"/>
+          </w:tcPr>
+          <w:p>
+            <w:r>
+              <w:t>59.9%</w:t>
             </w:r>
           </w:p>
         </w:tc>
@@ -325,10 +1800,10 @@
     <w:p/>
     <w:p>
       <w:pPr>
-        <w:pStyle w:val="Heading1"/>
+        <w:pStyle w:val="Heading2"/>
       </w:pPr>
       <w:r>
-        <w:t>1. Wellness</w:t>
+        <w:t>Wellness — $149/mo</w:t>
       </w:r>
     </w:p>
     <w:p>
@@ -358,15 +1833,15 @@
         <w:rPr>
           <w:b/>
         </w:rPr>
-        <w:t xml:space="preserve">Monthly Price: </w:t>
+        <w:t xml:space="preserve">Credits: </w:t>
       </w:r>
       <w:r>
-        <w:t>$149/mo</w:t>
+        <w:t>2 credits/mo</w:t>
       </w:r>
     </w:p>
     <w:p>
       <w:pPr>
-        <w:pStyle w:val="Heading2"/>
+        <w:pStyle w:val="Heading3"/>
       </w:pPr>
       <w:r>
         <w:t>Included Services</w:t>
@@ -377,7 +1852,7 @@
         <w:pStyle w:val="ListBullet"/>
       </w:pPr>
       <w:r>
-        <w:t>Guaranteed appointments within 3 business days</w:t>
+        <w:t>Appointments within 3 days</w:t>
       </w:r>
     </w:p>
     <w:p>
@@ -385,7 +1860,7 @@
         <w:pStyle w:val="ListBullet"/>
       </w:pPr>
       <w:r>
-        <w:t>Telehealth visits via Zoom</w:t>
+        <w:t>Telehealth via Zoom</w:t>
       </w:r>
     </w:p>
     <w:p>
@@ -406,6 +1881,14 @@
     </w:p>
     <w:p>
       <w:pPr>
+        <w:pStyle w:val="Heading3"/>
+      </w:pPr>
+      <w:r>
+        <w:t>Included Products</w:t>
+      </w:r>
+    </w:p>
+    <w:p>
+      <w:pPr>
         <w:pStyle w:val="ListBullet"/>
       </w:pPr>
       <w:r>
@@ -417,226 +1900,16 @@
         <w:pStyle w:val="ListBullet"/>
       </w:pPr>
       <w:r>
-        <w:t>15% discount on IV Therapy &amp; supplements</w:t>
+        <w:t>15% off IV Therapy &amp; supplements</w:t>
       </w:r>
     </w:p>
+    <w:p/>
     <w:p>
       <w:pPr>
         <w:pStyle w:val="Heading2"/>
       </w:pPr>
       <w:r>
-        <w:t>Available A La Carte Add-Ons</w:t>
-      </w:r>
-    </w:p>
-    <w:p>
-      <w:pPr>
-        <w:pStyle w:val="ListBullet"/>
-      </w:pPr>
-      <w:r>
-        <w:t>HRT &amp; hormone management</w:t>
-      </w:r>
-    </w:p>
-    <w:p>
-      <w:pPr>
-        <w:pStyle w:val="ListBullet"/>
-      </w:pPr>
-      <w:r>
-        <w:t>IV Vitamin Therapy</w:t>
-      </w:r>
-    </w:p>
-    <w:p>
-      <w:pPr>
-        <w:pStyle w:val="ListBullet"/>
-      </w:pPr>
-      <w:r>
-        <w:t>Aesthetics (Botox, fillers, etc.)</w:t>
-      </w:r>
-    </w:p>
-    <w:p>
-      <w:pPr>
-        <w:pStyle w:val="ListBullet"/>
-      </w:pPr>
-      <w:r>
-        <w:t>Body contouring</w:t>
-      </w:r>
-    </w:p>
-    <w:p>
-      <w:pPr>
-        <w:pStyle w:val="ListBullet"/>
-      </w:pPr>
-      <w:r>
-        <w:t>Laser treatments</w:t>
-      </w:r>
-    </w:p>
-    <w:p/>
-    <w:p>
-      <w:pPr>
-        <w:pStyle w:val="Heading1"/>
-      </w:pPr>
-      <w:r>
-        <w:t>2. Transform (Weight Loss Bundle)</w:t>
-      </w:r>
-    </w:p>
-    <w:p>
-      <w:r>
-        <w:rPr>
-          <w:b/>
-        </w:rPr>
-        <w:t xml:space="preserve">Tier: </w:t>
-      </w:r>
-      <w:r>
-        <w:t>Transform</w:t>
-      </w:r>
-    </w:p>
-    <w:p>
-      <w:r>
-        <w:rPr>
-          <w:b/>
-        </w:rPr>
-        <w:t xml:space="preserve">Starter Fee: </w:t>
-      </w:r>
-      <w:r>
-        <w:t>$149 (one-time)</w:t>
-      </w:r>
-    </w:p>
-    <w:p>
-      <w:r>
-        <w:rPr>
-          <w:b/>
-        </w:rPr>
-        <w:t xml:space="preserve">Monthly Price: </w:t>
-      </w:r>
-      <w:r>
-        <w:t>$299/mo</w:t>
-      </w:r>
-    </w:p>
-    <w:p>
-      <w:pPr>
-        <w:pStyle w:val="Heading2"/>
-      </w:pPr>
-      <w:r>
-        <w:t>Included Services</w:t>
-      </w:r>
-    </w:p>
-    <w:p>
-      <w:pPr>
-        <w:pStyle w:val="ListBullet"/>
-      </w:pPr>
-      <w:r>
-        <w:t>Everything in Wellness</w:t>
-      </w:r>
-    </w:p>
-    <w:p>
-      <w:pPr>
-        <w:pStyle w:val="ListBullet"/>
-      </w:pPr>
-      <w:r>
-        <w:t>GLP-1 medications (Semaglutide / Tirzepatide)</w:t>
-      </w:r>
-    </w:p>
-    <w:p>
-      <w:pPr>
-        <w:pStyle w:val="ListBullet"/>
-      </w:pPr>
-      <w:r>
-        <w:t>Weekly accountability consultations</w:t>
-      </w:r>
-    </w:p>
-    <w:p>
-      <w:pPr>
-        <w:pStyle w:val="ListBullet"/>
-      </w:pPr>
-      <w:r>
-        <w:t>Bi-weekly check-in meetings</w:t>
-      </w:r>
-    </w:p>
-    <w:p>
-      <w:pPr>
-        <w:pStyle w:val="ListBullet"/>
-      </w:pPr>
-      <w:r>
-        <w:t>Nutritionist meal planning</w:t>
-      </w:r>
-    </w:p>
-    <w:p>
-      <w:pPr>
-        <w:pStyle w:val="ListBullet"/>
-      </w:pPr>
-      <w:r>
-        <w:t>Personal exercise training</w:t>
-      </w:r>
-    </w:p>
-    <w:p>
-      <w:pPr>
-        <w:pStyle w:val="ListBullet"/>
-      </w:pPr>
-      <w:r>
-        <w:t>Weight loss supplement bundle</w:t>
-      </w:r>
-    </w:p>
-    <w:p>
-      <w:pPr>
-        <w:pStyle w:val="ListBullet"/>
-      </w:pPr>
-      <w:r>
-        <w:t>Monthly progress labs &amp; body composition analysis</w:t>
-      </w:r>
-    </w:p>
-    <w:p>
-      <w:pPr>
-        <w:pStyle w:val="Heading2"/>
-      </w:pPr>
-      <w:r>
-        <w:t>Available A La Carte Add-Ons</w:t>
-      </w:r>
-    </w:p>
-    <w:p>
-      <w:pPr>
-        <w:pStyle w:val="ListBullet"/>
-      </w:pPr>
-      <w:r>
-        <w:t>HRT &amp; hormone management</w:t>
-      </w:r>
-    </w:p>
-    <w:p>
-      <w:pPr>
-        <w:pStyle w:val="ListBullet"/>
-      </w:pPr>
-      <w:r>
-        <w:t>IV Vitamin Therapy</w:t>
-      </w:r>
-    </w:p>
-    <w:p>
-      <w:pPr>
-        <w:pStyle w:val="ListBullet"/>
-      </w:pPr>
-      <w:r>
-        <w:t>Aesthetics (Botox, fillers, etc.)</w:t>
-      </w:r>
-    </w:p>
-    <w:p>
-      <w:pPr>
-        <w:pStyle w:val="ListBullet"/>
-      </w:pPr>
-      <w:r>
-        <w:t>Body contouring</w:t>
-      </w:r>
-    </w:p>
-    <w:p>
-      <w:pPr>
-        <w:pStyle w:val="ListBullet"/>
-      </w:pPr>
-      <w:r>
-        <w:t>Laser treatments</w:t>
-      </w:r>
-    </w:p>
-    <w:p/>
-    <w:p>
-      <w:pPr>
-        <w:pStyle w:val="Heading1"/>
-      </w:pPr>
-      <w:r>
-        <w:t>3. Vitality</w:t>
+        <w:t>Vitality — $249/mo</w:t>
       </w:r>
     </w:p>
     <w:p>
@@ -658,7 +1931,7 @@
         <w:t xml:space="preserve">Starter Fee: </w:t>
       </w:r>
       <w:r>
-        <w:t>$199 (one-time)</w:t>
+        <w:t>$149 (one-time)</w:t>
       </w:r>
     </w:p>
     <w:p>
@@ -666,15 +1939,15 @@
         <w:rPr>
           <w:b/>
         </w:rPr>
-        <w:t xml:space="preserve">Monthly Price: </w:t>
+        <w:t xml:space="preserve">Credits: </w:t>
       </w:r>
       <w:r>
-        <w:t>$399/mo</w:t>
+        <w:t>4 credits/mo</w:t>
       </w:r>
     </w:p>
     <w:p>
       <w:pPr>
-        <w:pStyle w:val="Heading2"/>
+        <w:pStyle w:val="Heading3"/>
       </w:pPr>
       <w:r>
         <w:t>Included Services</w:t>
@@ -685,7 +1958,7 @@
         <w:pStyle w:val="ListBullet"/>
       </w:pPr>
       <w:r>
-        <w:t>Everything in Transform</w:t>
+        <w:t>Everything in Wellness</w:t>
       </w:r>
     </w:p>
     <w:p>
@@ -694,14 +1967,6 @@
       </w:pPr>
       <w:r>
         <w:t>HRT &amp; hormone management</w:t>
-      </w:r>
-    </w:p>
-    <w:p>
-      <w:pPr>
-        <w:pStyle w:val="ListBullet"/>
-      </w:pPr>
-      <w:r>
-        <w:t>IV Vitamin Therapy sessions</w:t>
       </w:r>
     </w:p>
     <w:p>
@@ -722,10 +1987,10 @@
     </w:p>
     <w:p>
       <w:pPr>
-        <w:pStyle w:val="Heading2"/>
+        <w:pStyle w:val="Heading3"/>
       </w:pPr>
       <w:r>
-        <w:t>Available A La Carte Add-Ons</w:t>
+        <w:t>Included Products</w:t>
       </w:r>
     </w:p>
     <w:p>
@@ -733,7 +1998,7 @@
         <w:pStyle w:val="ListBullet"/>
       </w:pPr>
       <w:r>
-        <w:t>Aesthetics (Botox, fillers, etc.)</w:t>
+        <w:t>Monthly Vitamin B-12 injection</w:t>
       </w:r>
     </w:p>
     <w:p>
@@ -741,7 +2006,7 @@
         <w:pStyle w:val="ListBullet"/>
       </w:pPr>
       <w:r>
-        <w:t>Body contouring</w:t>
+        <w:t>Monthly IV Vitamin Therapy session</w:t>
       </w:r>
     </w:p>
     <w:p>
@@ -749,16 +2014,16 @@
         <w:pStyle w:val="ListBullet"/>
       </w:pPr>
       <w:r>
-        <w:t>Laser treatments</w:t>
+        <w:t>20% off all aesthetics</w:t>
       </w:r>
     </w:p>
     <w:p/>
     <w:p>
       <w:pPr>
-        <w:pStyle w:val="Heading1"/>
+        <w:pStyle w:val="Heading2"/>
       </w:pPr>
       <w:r>
-        <w:t>4. Concierge (All-Inclusive)</w:t>
+        <w:t>Elite — $399/mo</w:t>
       </w:r>
     </w:p>
     <w:p>
@@ -780,7 +2045,7 @@
         <w:t xml:space="preserve">Starter Fee: </w:t>
       </w:r>
       <w:r>
-        <w:t>$249 (one-time)</w:t>
+        <w:t>$199 (one-time)</w:t>
       </w:r>
     </w:p>
     <w:p>
@@ -788,15 +2053,15 @@
         <w:rPr>
           <w:b/>
         </w:rPr>
-        <w:t xml:space="preserve">Monthly Price: </w:t>
+        <w:t xml:space="preserve">Credits: </w:t>
       </w:r>
       <w:r>
-        <w:t>$599/mo</w:t>
+        <w:t>8 credits/mo</w:t>
       </w:r>
     </w:p>
     <w:p>
       <w:pPr>
-        <w:pStyle w:val="Heading2"/>
+        <w:pStyle w:val="Heading3"/>
       </w:pPr>
       <w:r>
         <w:t>Included Services</w:t>
@@ -831,6 +2096,112 @@
         <w:pStyle w:val="ListBullet"/>
       </w:pPr>
       <w:r>
+        <w:t>Direct physician line</w:t>
+      </w:r>
+    </w:p>
+    <w:p>
+      <w:pPr>
+        <w:pStyle w:val="Heading3"/>
+      </w:pPr>
+      <w:r>
+        <w:t>Included Products</w:t>
+      </w:r>
+    </w:p>
+    <w:p>
+      <w:pPr>
+        <w:pStyle w:val="ListBullet"/>
+      </w:pPr>
+      <w:r>
+        <w:t>Monthly Vitamin B-12 injection</w:t>
+      </w:r>
+    </w:p>
+    <w:p>
+      <w:pPr>
+        <w:pStyle w:val="ListBullet"/>
+      </w:pPr>
+      <w:r>
+        <w:t>Monthly IV Vitamin Therapy session</w:t>
+      </w:r>
+    </w:p>
+    <w:p>
+      <w:pPr>
+        <w:pStyle w:val="ListBullet"/>
+      </w:pPr>
+      <w:r>
+        <w:t>Monthly supplement bundle</w:t>
+      </w:r>
+    </w:p>
+    <w:p>
+      <w:pPr>
+        <w:pStyle w:val="ListBullet"/>
+      </w:pPr>
+      <w:r>
+        <w:t>30% off all aesthetics &amp; lasers</w:t>
+      </w:r>
+    </w:p>
+    <w:p/>
+    <w:p>
+      <w:pPr>
+        <w:pStyle w:val="Heading2"/>
+      </w:pPr>
+      <w:r>
+        <w:t>Concierge — $599/mo</w:t>
+      </w:r>
+    </w:p>
+    <w:p>
+      <w:r>
+        <w:rPr>
+          <w:b/>
+        </w:rPr>
+        <w:t xml:space="preserve">Tier: </w:t>
+      </w:r>
+      <w:r>
+        <w:t>VIP</w:t>
+      </w:r>
+    </w:p>
+    <w:p>
+      <w:r>
+        <w:rPr>
+          <w:b/>
+        </w:rPr>
+        <w:t xml:space="preserve">Starter Fee: </w:t>
+      </w:r>
+      <w:r>
+        <w:t>$249 (one-time)</w:t>
+      </w:r>
+    </w:p>
+    <w:p>
+      <w:r>
+        <w:rPr>
+          <w:b/>
+        </w:rPr>
+        <w:t xml:space="preserve">Credits: </w:t>
+      </w:r>
+      <w:r>
+        <w:t>Unlimited credits/mo</w:t>
+      </w:r>
+    </w:p>
+    <w:p>
+      <w:pPr>
+        <w:pStyle w:val="Heading3"/>
+      </w:pPr>
+      <w:r>
+        <w:t>Included Services</w:t>
+      </w:r>
+    </w:p>
+    <w:p>
+      <w:pPr>
+        <w:pStyle w:val="ListBullet"/>
+      </w:pPr>
+      <w:r>
+        <w:t>Everything in Elite</w:t>
+      </w:r>
+    </w:p>
+    <w:p>
+      <w:pPr>
+        <w:pStyle w:val="ListBullet"/>
+      </w:pPr>
+      <w:r>
         <w:t>RF Microneedling (Morpheus8)</w:t>
       </w:r>
     </w:p>
@@ -852,19 +2223,34 @@
     </w:p>
     <w:p>
       <w:pPr>
+        <w:pStyle w:val="Heading3"/>
+      </w:pPr>
+      <w:r>
+        <w:t>Included Products</w:t>
+      </w:r>
+    </w:p>
+    <w:p>
+      <w:pPr>
         <w:pStyle w:val="ListBullet"/>
       </w:pPr>
       <w:r>
-        <w:t>Direct physician line</w:t>
+        <w:t>All products included</w:t>
       </w:r>
     </w:p>
     <w:p>
+      <w:pPr>
+        <w:pStyle w:val="ListBullet"/>
+      </w:pPr>
       <w:r>
-        <w:rPr>
-          <w:i/>
-          <w:color w:val="339933"/>
-        </w:rPr>
-        <w:t>No a la carte needed — all services included.</w:t>
+        <w:t>Priority scheduling</w:t>
+      </w:r>
+    </w:p>
+    <w:p>
+      <w:pPr>
+        <w:pStyle w:val="ListBullet"/>
+      </w:pPr>
+      <w:r>
+        <w:t>Complimentary guest passes (2/mo)</w:t>
       </w:r>
     </w:p>
     <w:p/>
@@ -876,415 +2262,9 @@
         <w:t>Financial Summary</w:t>
       </w:r>
     </w:p>
-    <w:tbl>
-      <w:tblPr>
-        <w:tblStyle w:val="MediumShading1-Accent1"/>
-        <w:tblW w:type="auto" w:w="0"/>
-        <w:jc w:val="center"/>
-        <w:tblLook w:firstColumn="1" w:firstRow="1" w:lastColumn="0" w:lastRow="0" w:noHBand="0" w:noVBand="1" w:val="04A0"/>
-      </w:tblPr>
-      <w:tblGrid>
-        <w:gridCol w:w="1234"/>
-        <w:gridCol w:w="1234"/>
-        <w:gridCol w:w="1234"/>
-        <w:gridCol w:w="1234"/>
-        <w:gridCol w:w="1234"/>
-        <w:gridCol w:w="1234"/>
-        <w:gridCol w:w="1234"/>
-      </w:tblGrid>
-      <w:tr>
-        <w:tc>
-          <w:tcPr>
-            <w:tcW w:type="dxa" w:w="1234"/>
-          </w:tcPr>
-          <w:p>
-            <w:r>
-              <w:rPr>
-                <w:b/>
-                <w:sz w:val="18"/>
-              </w:rPr>
-              <w:t>Membership</w:t>
-            </w:r>
-          </w:p>
-        </w:tc>
-        <w:tc>
-          <w:tcPr>
-            <w:tcW w:type="dxa" w:w="1234"/>
-          </w:tcPr>
-          <w:p>
-            <w:r>
-              <w:rPr>
-                <w:b/>
-                <w:sz w:val="18"/>
-              </w:rPr>
-              <w:t>Starter Fee</w:t>
-            </w:r>
-          </w:p>
-        </w:tc>
-        <w:tc>
-          <w:tcPr>
-            <w:tcW w:type="dxa" w:w="1234"/>
-          </w:tcPr>
-          <w:p>
-            <w:r>
-              <w:rPr>
-                <w:b/>
-                <w:sz w:val="18"/>
-              </w:rPr>
-              <w:t>Cost/Member</w:t>
-            </w:r>
-          </w:p>
-        </w:tc>
-        <w:tc>
-          <w:tcPr>
-            <w:tcW w:type="dxa" w:w="1234"/>
-          </w:tcPr>
-          <w:p>
-            <w:r>
-              <w:rPr>
-                <w:b/>
-                <w:sz w:val="18"/>
-              </w:rPr>
-              <w:t>Monthly Price</w:t>
-            </w:r>
-          </w:p>
-        </w:tc>
-        <w:tc>
-          <w:tcPr>
-            <w:tcW w:type="dxa" w:w="1234"/>
-          </w:tcPr>
-          <w:p>
-            <w:r>
-              <w:rPr>
-                <w:b/>
-                <w:sz w:val="18"/>
-              </w:rPr>
-              <w:t>Margin</w:t>
-            </w:r>
-          </w:p>
-        </w:tc>
-        <w:tc>
-          <w:tcPr>
-            <w:tcW w:type="dxa" w:w="1234"/>
-          </w:tcPr>
-          <w:p>
-            <w:r>
-              <w:rPr>
-                <w:b/>
-                <w:sz w:val="18"/>
-              </w:rPr>
-              <w:t>Est. Members</w:t>
-            </w:r>
-          </w:p>
-        </w:tc>
-        <w:tc>
-          <w:tcPr>
-            <w:tcW w:type="dxa" w:w="1234"/>
-          </w:tcPr>
-          <w:p>
-            <w:r>
-              <w:rPr>
-                <w:b/>
-                <w:sz w:val="18"/>
-              </w:rPr>
-              <w:t>Year 1 Value/Member</w:t>
-            </w:r>
-          </w:p>
-        </w:tc>
-      </w:tr>
-      <w:tr>
-        <w:tc>
-          <w:tcPr>
-            <w:tcW w:type="dxa" w:w="1234"/>
-          </w:tcPr>
-          <w:p>
-            <w:r>
-              <w:t>Wellness</w:t>
-            </w:r>
-          </w:p>
-        </w:tc>
-        <w:tc>
-          <w:tcPr>
-            <w:tcW w:type="dxa" w:w="1234"/>
-          </w:tcPr>
-          <w:p>
-            <w:r>
-              <w:t>$99</w:t>
-            </w:r>
-          </w:p>
-        </w:tc>
-        <w:tc>
-          <w:tcPr>
-            <w:tcW w:type="dxa" w:w="1234"/>
-          </w:tcPr>
-          <w:p>
-            <w:r>
-              <w:t>$45</w:t>
-            </w:r>
-          </w:p>
-        </w:tc>
-        <w:tc>
-          <w:tcPr>
-            <w:tcW w:type="dxa" w:w="1234"/>
-          </w:tcPr>
-          <w:p>
-            <w:r>
-              <w:t>$149</w:t>
-            </w:r>
-          </w:p>
-        </w:tc>
-        <w:tc>
-          <w:tcPr>
-            <w:tcW w:type="dxa" w:w="1234"/>
-          </w:tcPr>
-          <w:p>
-            <w:r>
-              <w:t>69.8%</w:t>
-            </w:r>
-          </w:p>
-        </w:tc>
-        <w:tc>
-          <w:tcPr>
-            <w:tcW w:type="dxa" w:w="1234"/>
-          </w:tcPr>
-          <w:p>
-            <w:r>
-              <w:t>180</w:t>
-            </w:r>
-          </w:p>
-        </w:tc>
-        <w:tc>
-          <w:tcPr>
-            <w:tcW w:type="dxa" w:w="1234"/>
-          </w:tcPr>
-          <w:p>
-            <w:r>
-              <w:t>$1,887</w:t>
-            </w:r>
-          </w:p>
-        </w:tc>
-      </w:tr>
-      <w:tr>
-        <w:tc>
-          <w:tcPr>
-            <w:tcW w:type="dxa" w:w="1234"/>
-          </w:tcPr>
-          <w:p>
-            <w:r>
-              <w:t>Transform</w:t>
-            </w:r>
-          </w:p>
-        </w:tc>
-        <w:tc>
-          <w:tcPr>
-            <w:tcW w:type="dxa" w:w="1234"/>
-          </w:tcPr>
-          <w:p>
-            <w:r>
-              <w:t>$149</w:t>
-            </w:r>
-          </w:p>
-        </w:tc>
-        <w:tc>
-          <w:tcPr>
-            <w:tcW w:type="dxa" w:w="1234"/>
-          </w:tcPr>
-          <w:p>
-            <w:r>
-              <w:t>$110</w:t>
-            </w:r>
-          </w:p>
-        </w:tc>
-        <w:tc>
-          <w:tcPr>
-            <w:tcW w:type="dxa" w:w="1234"/>
-          </w:tcPr>
-          <w:p>
-            <w:r>
-              <w:t>$299</w:t>
-            </w:r>
-          </w:p>
-        </w:tc>
-        <w:tc>
-          <w:tcPr>
-            <w:tcW w:type="dxa" w:w="1234"/>
-          </w:tcPr>
-          <w:p>
-            <w:r>
-              <w:t>63.2%</w:t>
-            </w:r>
-          </w:p>
-        </w:tc>
-        <w:tc>
-          <w:tcPr>
-            <w:tcW w:type="dxa" w:w="1234"/>
-          </w:tcPr>
-          <w:p>
-            <w:r>
-              <w:t>150</w:t>
-            </w:r>
-          </w:p>
-        </w:tc>
-        <w:tc>
-          <w:tcPr>
-            <w:tcW w:type="dxa" w:w="1234"/>
-          </w:tcPr>
-          <w:p>
-            <w:r>
-              <w:t>$3,737</w:t>
-            </w:r>
-          </w:p>
-        </w:tc>
-      </w:tr>
-      <w:tr>
-        <w:tc>
-          <w:tcPr>
-            <w:tcW w:type="dxa" w:w="1234"/>
-          </w:tcPr>
-          <w:p>
-            <w:r>
-              <w:t>Vitality</w:t>
-            </w:r>
-          </w:p>
-        </w:tc>
-        <w:tc>
-          <w:tcPr>
-            <w:tcW w:type="dxa" w:w="1234"/>
-          </w:tcPr>
-          <w:p>
-            <w:r>
-              <w:t>$199</w:t>
-            </w:r>
-          </w:p>
-        </w:tc>
-        <w:tc>
-          <w:tcPr>
-            <w:tcW w:type="dxa" w:w="1234"/>
-          </w:tcPr>
-          <w:p>
-            <w:r>
-              <w:t>$155</w:t>
-            </w:r>
-          </w:p>
-        </w:tc>
-        <w:tc>
-          <w:tcPr>
-            <w:tcW w:type="dxa" w:w="1234"/>
-          </w:tcPr>
-          <w:p>
-            <w:r>
-              <w:t>$399</w:t>
-            </w:r>
-          </w:p>
-        </w:tc>
-        <w:tc>
-          <w:tcPr>
-            <w:tcW w:type="dxa" w:w="1234"/>
-          </w:tcPr>
-          <w:p>
-            <w:r>
-              <w:t>61.2%</w:t>
-            </w:r>
-          </w:p>
-        </w:tc>
-        <w:tc>
-          <w:tcPr>
-            <w:tcW w:type="dxa" w:w="1234"/>
-          </w:tcPr>
-          <w:p>
-            <w:r>
-              <w:t>90</w:t>
-            </w:r>
-          </w:p>
-        </w:tc>
-        <w:tc>
-          <w:tcPr>
-            <w:tcW w:type="dxa" w:w="1234"/>
-          </w:tcPr>
-          <w:p>
-            <w:r>
-              <w:t>$4,987</w:t>
-            </w:r>
-          </w:p>
-        </w:tc>
-      </w:tr>
-      <w:tr>
-        <w:tc>
-          <w:tcPr>
-            <w:tcW w:type="dxa" w:w="1234"/>
-          </w:tcPr>
-          <w:p>
-            <w:r>
-              <w:t>Concierge</w:t>
-            </w:r>
-          </w:p>
-        </w:tc>
-        <w:tc>
-          <w:tcPr>
-            <w:tcW w:type="dxa" w:w="1234"/>
-          </w:tcPr>
-          <w:p>
-            <w:r>
-              <w:t>$249</w:t>
-            </w:r>
-          </w:p>
-        </w:tc>
-        <w:tc>
-          <w:tcPr>
-            <w:tcW w:type="dxa" w:w="1234"/>
-          </w:tcPr>
-          <w:p>
-            <w:r>
-              <w:t>$240</w:t>
-            </w:r>
-          </w:p>
-        </w:tc>
-        <w:tc>
-          <w:tcPr>
-            <w:tcW w:type="dxa" w:w="1234"/>
-          </w:tcPr>
-          <w:p>
-            <w:r>
-              <w:t>$599</w:t>
-            </w:r>
-          </w:p>
-        </w:tc>
-        <w:tc>
-          <w:tcPr>
-            <w:tcW w:type="dxa" w:w="1234"/>
-          </w:tcPr>
-          <w:p>
-            <w:r>
-              <w:t>59.9%</w:t>
-            </w:r>
-          </w:p>
-        </w:tc>
-        <w:tc>
-          <w:tcPr>
-            <w:tcW w:type="dxa" w:w="1234"/>
-          </w:tcPr>
-          <w:p>
-            <w:r>
-              <w:t>35</w:t>
-            </w:r>
-          </w:p>
-        </w:tc>
-        <w:tc>
-          <w:tcPr>
-            <w:tcW w:type="dxa" w:w="1234"/>
-          </w:tcPr>
-          <w:p>
-            <w:r>
-              <w:t>$7,437</w:t>
-            </w:r>
-          </w:p>
-        </w:tc>
-      </w:tr>
-    </w:tbl>
-    <w:p/>
     <w:p>
       <w:pPr>
-        <w:pStyle w:val="Heading1"/>
+        <w:pStyle w:val="Heading2"/>
       </w:pPr>
       <w:r>
         <w:t>Revenue Breakdown</w:t>
@@ -1298,61 +2278,33 @@
         <w:tblLook w:firstColumn="1" w:firstRow="1" w:lastColumn="0" w:lastRow="0" w:noHBand="0" w:noVBand="1" w:val="04A0"/>
       </w:tblPr>
       <w:tblGrid>
-        <w:gridCol w:w="2160"/>
-        <w:gridCol w:w="2160"/>
-        <w:gridCol w:w="2160"/>
-        <w:gridCol w:w="2160"/>
+        <w:gridCol w:w="4320"/>
+        <w:gridCol w:w="4320"/>
       </w:tblGrid>
       <w:tr>
         <w:tc>
           <w:tcPr>
-            <w:tcW w:type="dxa" w:w="2160"/>
+            <w:tcW w:type="dxa" w:w="4320"/>
           </w:tcPr>
           <w:p>
             <w:r>
               <w:rPr>
                 <w:b/>
               </w:rPr>
-              <w:t>Membership</w:t>
+              <w:t>Revenue Stream</w:t>
             </w:r>
           </w:p>
         </w:tc>
         <w:tc>
           <w:tcPr>
-            <w:tcW w:type="dxa" w:w="2160"/>
+            <w:tcW w:type="dxa" w:w="4320"/>
           </w:tcPr>
           <w:p>
             <w:r>
               <w:rPr>
                 <w:b/>
               </w:rPr>
-              <w:t>Monthly Revenue</w:t>
-            </w:r>
-          </w:p>
-        </w:tc>
-        <w:tc>
-          <w:tcPr>
-            <w:tcW w:type="dxa" w:w="2160"/>
-          </w:tcPr>
-          <w:p>
-            <w:r>
-              <w:rPr>
-                <w:b/>
-              </w:rPr>
-              <w:t>Starter Fee Revenue</w:t>
-            </w:r>
-          </w:p>
-        </w:tc>
-        <w:tc>
-          <w:tcPr>
-            <w:tcW w:type="dxa" w:w="2160"/>
-          </w:tcPr>
-          <w:p>
-            <w:r>
-              <w:rPr>
-                <w:b/>
-              </w:rPr>
-              <w:t>Total</w:t>
+              <w:t>Amount</w:t>
             </w:r>
           </w:p>
         </w:tc>
@@ -1360,41 +2312,21 @@
       <w:tr>
         <w:tc>
           <w:tcPr>
-            <w:tcW w:type="dxa" w:w="2160"/>
+            <w:tcW w:type="dxa" w:w="4320"/>
           </w:tcPr>
           <w:p>
             <w:r>
-              <w:t>Wellness</w:t>
+              <w:t>Membership MRR (monthly recurring)</w:t>
             </w:r>
           </w:p>
         </w:tc>
         <w:tc>
           <w:tcPr>
-            <w:tcW w:type="dxa" w:w="2160"/>
+            <w:tcW w:type="dxa" w:w="4320"/>
           </w:tcPr>
           <w:p>
             <w:r>
-              <w:t>$26,820</w:t>
-            </w:r>
-          </w:p>
-        </w:tc>
-        <w:tc>
-          <w:tcPr>
-            <w:tcW w:type="dxa" w:w="2160"/>
-          </w:tcPr>
-          <w:p>
-            <w:r>
-              <w:t>$17,820</w:t>
-            </w:r>
-          </w:p>
-        </w:tc>
-        <w:tc>
-          <w:tcPr>
-            <w:tcW w:type="dxa" w:w="2160"/>
-          </w:tcPr>
-          <w:p>
-            <w:r>
-              <w:t>$44,640</w:t>
+              <w:t>$84,155</w:t>
             </w:r>
           </w:p>
         </w:tc>
@@ -1402,41 +2334,21 @@
       <w:tr>
         <w:tc>
           <w:tcPr>
-            <w:tcW w:type="dxa" w:w="2160"/>
+            <w:tcW w:type="dxa" w:w="4320"/>
           </w:tcPr>
           <w:p>
             <w:r>
-              <w:t>Transform</w:t>
+              <w:t>Package Revenue (one-time bundles)</w:t>
             </w:r>
           </w:p>
         </w:tc>
         <w:tc>
           <w:tcPr>
-            <w:tcW w:type="dxa" w:w="2160"/>
+            <w:tcW w:type="dxa" w:w="4320"/>
           </w:tcPr>
           <w:p>
             <w:r>
-              <w:t>$44,850</w:t>
-            </w:r>
-          </w:p>
-        </w:tc>
-        <w:tc>
-          <w:tcPr>
-            <w:tcW w:type="dxa" w:w="2160"/>
-          </w:tcPr>
-          <w:p>
-            <w:r>
-              <w:t>$22,350</w:t>
-            </w:r>
-          </w:p>
-        </w:tc>
-        <w:tc>
-          <w:tcPr>
-            <w:tcW w:type="dxa" w:w="2160"/>
-          </w:tcPr>
-          <w:p>
-            <w:r>
-              <w:t>$67,200</w:t>
+              <w:t>$112,890</w:t>
             </w:r>
           </w:p>
         </w:tc>
@@ -1444,137 +2356,21 @@
       <w:tr>
         <w:tc>
           <w:tcPr>
-            <w:tcW w:type="dxa" w:w="2160"/>
+            <w:tcW w:type="dxa" w:w="4320"/>
           </w:tcPr>
           <w:p>
             <w:r>
-              <w:t>Vitality</w:t>
+              <w:t>Starter Fee Revenue (one-time)</w:t>
             </w:r>
           </w:p>
         </w:tc>
         <w:tc>
           <w:tcPr>
-            <w:tcW w:type="dxa" w:w="2160"/>
+            <w:tcW w:type="dxa" w:w="4320"/>
           </w:tcPr>
           <w:p>
             <w:r>
-              <w:t>$35,910</w:t>
-            </w:r>
-          </w:p>
-        </w:tc>
-        <w:tc>
-          <w:tcPr>
-            <w:tcW w:type="dxa" w:w="2160"/>
-          </w:tcPr>
-          <w:p>
-            <w:r>
-              <w:t>$17,910</w:t>
-            </w:r>
-          </w:p>
-        </w:tc>
-        <w:tc>
-          <w:tcPr>
-            <w:tcW w:type="dxa" w:w="2160"/>
-          </w:tcPr>
-          <w:p>
-            <w:r>
-              <w:t>$53,820</w:t>
-            </w:r>
-          </w:p>
-        </w:tc>
-      </w:tr>
-      <w:tr>
-        <w:tc>
-          <w:tcPr>
-            <w:tcW w:type="dxa" w:w="2160"/>
-          </w:tcPr>
-          <w:p>
-            <w:r>
-              <w:t>Concierge</w:t>
-            </w:r>
-          </w:p>
-        </w:tc>
-        <w:tc>
-          <w:tcPr>
-            <w:tcW w:type="dxa" w:w="2160"/>
-          </w:tcPr>
-          <w:p>
-            <w:r>
-              <w:t>$20,965</w:t>
-            </w:r>
-          </w:p>
-        </w:tc>
-        <w:tc>
-          <w:tcPr>
-            <w:tcW w:type="dxa" w:w="2160"/>
-          </w:tcPr>
-          <w:p>
-            <w:r>
-              <w:t>$8,715</w:t>
-            </w:r>
-          </w:p>
-        </w:tc>
-        <w:tc>
-          <w:tcPr>
-            <w:tcW w:type="dxa" w:w="2160"/>
-          </w:tcPr>
-          <w:p>
-            <w:r>
-              <w:t>$29,680</w:t>
-            </w:r>
-          </w:p>
-        </w:tc>
-      </w:tr>
-      <w:tr>
-        <w:tc>
-          <w:tcPr>
-            <w:tcW w:type="dxa" w:w="2160"/>
-          </w:tcPr>
-          <w:p>
-            <w:r>
-              <w:rPr>
-                <w:b/>
-              </w:rPr>
-              <w:t>TOTAL</w:t>
-            </w:r>
-          </w:p>
-        </w:tc>
-        <w:tc>
-          <w:tcPr>
-            <w:tcW w:type="dxa" w:w="2160"/>
-          </w:tcPr>
-          <w:p>
-            <w:r>
-              <w:rPr>
-                <w:b/>
-              </w:rPr>
-              <w:t>$128,545</w:t>
-            </w:r>
-          </w:p>
-        </w:tc>
-        <w:tc>
-          <w:tcPr>
-            <w:tcW w:type="dxa" w:w="2160"/>
-          </w:tcPr>
-          <w:p>
-            <w:r>
-              <w:rPr>
-                <w:b/>
-              </w:rPr>
-              <w:t>$66,795</w:t>
-            </w:r>
-          </w:p>
-        </w:tc>
-        <w:tc>
-          <w:tcPr>
-            <w:tcW w:type="dxa" w:w="2160"/>
-          </w:tcPr>
-          <w:p>
-            <w:r>
-              <w:rPr>
-                <w:b/>
-              </w:rPr>
-              <w:t>$195,340</w:t>
+              <w:t>$47,405</w:t>
             </w:r>
           </w:p>
         </w:tc>
@@ -1583,7 +2379,7 @@
     <w:p/>
     <w:p>
       <w:pPr>
-        <w:pStyle w:val="Heading1"/>
+        <w:pStyle w:val="Heading2"/>
       </w:pPr>
       <w:r>
         <w:t>Key Metrics</w:t>
@@ -1635,7 +2431,7 @@
           </w:tcPr>
           <w:p>
             <w:r>
-              <w:t>Monthly Recurring Revenue</w:t>
+              <w:t>Total Revenue</w:t>
             </w:r>
           </w:p>
         </w:tc>
@@ -1645,7 +2441,7 @@
           </w:tcPr>
           <w:p>
             <w:r>
-              <w:t>$128,545</w:t>
+              <w:t>$244,450</w:t>
             </w:r>
           </w:p>
         </w:tc>
@@ -1657,7 +2453,7 @@
           </w:tcPr>
           <w:p>
             <w:r>
-              <w:t>One-Time Starter Fee Revenue</w:t>
+              <w:t>Membership MRR</w:t>
             </w:r>
           </w:p>
         </w:tc>
@@ -1667,7 +2463,7 @@
           </w:tcPr>
           <w:p>
             <w:r>
-              <w:t>$66,795</w:t>
+              <w:t>$84,155</w:t>
             </w:r>
           </w:p>
         </w:tc>
@@ -1679,7 +2475,7 @@
           </w:tcPr>
           <w:p>
             <w:r>
-              <w:t>Total Revenue</w:t>
+              <w:t>Package Revenue</w:t>
             </w:r>
           </w:p>
         </w:tc>
@@ -1689,7 +2485,29 @@
           </w:tcPr>
           <w:p>
             <w:r>
-              <w:t>$195,340</w:t>
+              <w:t>$112,890</w:t>
+            </w:r>
+          </w:p>
+        </w:tc>
+      </w:tr>
+      <w:tr>
+        <w:tc>
+          <w:tcPr>
+            <w:tcW w:type="dxa" w:w="4320"/>
+          </w:tcPr>
+          <w:p>
+            <w:r>
+              <w:t>Starter Fee Revenue</w:t>
+            </w:r>
+          </w:p>
+        </w:tc>
+        <w:tc>
+          <w:tcPr>
+            <w:tcW w:type="dxa" w:w="4320"/>
+          </w:tcPr>
+          <w:p>
+            <w:r>
+              <w:t>$47,405</w:t>
             </w:r>
           </w:p>
         </w:tc>
@@ -1821,7 +2639,7 @@
           </w:tcPr>
           <w:p>
             <w:r>
-              <w:t>455</w:t>
+              <w:t>345</w:t>
             </w:r>
           </w:p>
         </w:tc>

</xml_diff>